<commit_message>
Recargar plantilla oficial de LOG-026 y habilitar recarga en modulo de administracion
</commit_message>
<xml_diff>
--- a/LOG-026-Acta de Verificacion y Legalizacion de para bolsa_V1.docx
+++ b/LOG-026-Acta de Verificacion y Legalizacion de para bolsa_V1.docx
@@ -108,7 +108,6 @@
                 <w:iCs/>
                 <w:sz w:val="22"/>
                 <w:szCs w:val="22"/>
-                <w:highlight w:val="red"/>
               </w:rPr>
             </w:pPr>
           </w:p>
@@ -127,7 +126,6 @@
                 <w:iCs/>
                 <w:sz w:val="22"/>
                 <w:szCs w:val="22"/>
-                <w:highlight w:val="red"/>
               </w:rPr>
             </w:pPr>
             <w:r>
@@ -153,7 +151,6 @@
                 <w:iCs/>
                 <w:sz w:val="22"/>
                 <w:szCs w:val="22"/>
-                <w:highlight w:val="red"/>
               </w:rPr>
             </w:pPr>
           </w:p>
@@ -202,7 +199,6 @@
                 <w:iCs/>
                 <w:sz w:val="22"/>
                 <w:szCs w:val="22"/>
-                <w:highlight w:val="red"/>
               </w:rPr>
             </w:pPr>
           </w:p>
@@ -246,7 +242,6 @@
                 <w:iCs/>
                 <w:sz w:val="22"/>
                 <w:szCs w:val="22"/>
-                <w:highlight w:val="red"/>
               </w:rPr>
             </w:pPr>
           </w:p>
@@ -3440,7 +3435,6 @@
                     </w:rPr>
                   </w:pPr>
                   <w:proofErr w:type="spellStart"/>
-                  <w:proofErr w:type="gramStart"/>
                   <w:r>
                     <w:rPr>
                       <w:rFonts w:ascii="Verdana" w:hAnsi="Verdana" w:cs="Arial"/>
@@ -3458,7 +3452,6 @@
                     <w:t>ybohorquez@cpe.gov.co</w:t>
                   </w:r>
                   <w:proofErr w:type="spellEnd"/>
-                  <w:proofErr w:type="gramEnd"/>
                 </w:p>
               </w:tc>
               <w:tc>
@@ -6556,6 +6549,21 @@
 </file>
 
 <file path=customXml/item1.xml><?xml version="1.0" encoding="utf-8"?>
+<p:properties xmlns:p="http://schemas.microsoft.com/office/2006/metadata/properties" xmlns:xsi="http://www.w3.org/2001/XMLSchema-instance" xmlns:pc="http://schemas.microsoft.com/office/infopath/2007/PartnerControls">
+  <documentManagement/>
+</p:properties>
+</file>
+
+<file path=customXml/item2.xml><?xml version="1.0" encoding="utf-8"?>
+<?mso-contentType ?>
+<FormTemplates xmlns="http://schemas.microsoft.com/sharepoint/v3/contenttype/forms">
+  <Display>DocumentLibraryForm</Display>
+  <Edit>DocumentLibraryForm</Edit>
+  <New>DocumentLibraryForm</New>
+</FormTemplates>
+</file>
+
+<file path=customXml/item3.xml><?xml version="1.0" encoding="utf-8"?>
 <ct:contentTypeSchema xmlns:ct="http://schemas.microsoft.com/office/2006/metadata/contentType" xmlns:ma="http://schemas.microsoft.com/office/2006/metadata/properties/metaAttributes" ct:_="" ma:_="" ma:contentTypeName="Document" ma:contentTypeID="0x010100A30B331C4838804993200D47FCE41471" ma:contentTypeVersion="11" ma:contentTypeDescription="Create a new document." ma:contentTypeScope="" ma:versionID="d9801eb647fd58e56a8b175437891573">
   <xsd:schema xmlns:xsd="http://www.w3.org/2001/XMLSchema" xmlns:xs="http://www.w3.org/2001/XMLSchema" xmlns:p="http://schemas.microsoft.com/office/2006/metadata/properties" xmlns:ns3="2e532581-20e9-408c-a3d6-754b6c32e08b" xmlns:ns4="ab9f0e5a-eb09-4b64-a8eb-5db8af803633" targetNamespace="http://schemas.microsoft.com/office/2006/metadata/properties" ma:root="true" ma:fieldsID="c3d21b39ec3e984babe6119bab9014b0" ns3:_="" ns4:_="">
     <xsd:import namespace="2e532581-20e9-408c-a3d6-754b6c32e08b"/>
@@ -6764,26 +6772,28 @@
 </ct:contentTypeSchema>
 </file>
 
-<file path=customXml/item2.xml><?xml version="1.0" encoding="utf-8"?>
-<?mso-contentType ?>
-<FormTemplates xmlns="http://schemas.microsoft.com/sharepoint/v3/contenttype/forms">
-  <Display>DocumentLibraryForm</Display>
-  <Edit>DocumentLibraryForm</Edit>
-  <New>DocumentLibraryForm</New>
-</FormTemplates>
-</file>
-
-<file path=customXml/item3.xml><?xml version="1.0" encoding="utf-8"?>
-<p:properties xmlns:p="http://schemas.microsoft.com/office/2006/metadata/properties" xmlns:xsi="http://www.w3.org/2001/XMLSchema-instance" xmlns:pc="http://schemas.microsoft.com/office/infopath/2007/PartnerControls">
-  <documentManagement/>
-</p:properties>
-</file>
-
 <file path=customXml/item4.xml><?xml version="1.0" encoding="utf-8"?>
 <b:Sources xmlns:b="http://schemas.openxmlformats.org/officeDocument/2006/bibliography" xmlns="http://schemas.openxmlformats.org/officeDocument/2006/bibliography" SelectedStyle="\APASixthEditionOfficeOnline.xsl" StyleName="APA" Version="6"/>
 </file>
 
 <file path=customXml/itemProps1.xml><?xml version="1.0" encoding="utf-8"?>
+<ds:datastoreItem xmlns:ds="http://schemas.openxmlformats.org/officeDocument/2006/customXml" ds:itemID="{8B7F66FD-9D04-4EC5-B43D-084D53B4EF9C}">
+  <ds:schemaRefs>
+    <ds:schemaRef ds:uri="http://schemas.microsoft.com/office/2006/metadata/properties"/>
+    <ds:schemaRef ds:uri="http://schemas.microsoft.com/office/infopath/2007/PartnerControls"/>
+  </ds:schemaRefs>
+</ds:datastoreItem>
+</file>
+
+<file path=customXml/itemProps2.xml><?xml version="1.0" encoding="utf-8"?>
+<ds:datastoreItem xmlns:ds="http://schemas.openxmlformats.org/officeDocument/2006/customXml" ds:itemID="{0AD0403F-4538-4F35-895B-4A73F29FF4F4}">
+  <ds:schemaRefs>
+    <ds:schemaRef ds:uri="http://schemas.microsoft.com/sharepoint/v3/contenttype/forms"/>
+  </ds:schemaRefs>
+</ds:datastoreItem>
+</file>
+
+<file path=customXml/itemProps3.xml><?xml version="1.0" encoding="utf-8"?>
 <ds:datastoreItem xmlns:ds="http://schemas.openxmlformats.org/officeDocument/2006/customXml" ds:itemID="{36349CA1-45D6-4016-A788-A8C5D419407B}">
   <ds:schemaRefs>
     <ds:schemaRef ds:uri="http://schemas.microsoft.com/office/2006/metadata/contentType"/>
@@ -6802,23 +6812,6 @@
 </ds:datastoreItem>
 </file>
 
-<file path=customXml/itemProps2.xml><?xml version="1.0" encoding="utf-8"?>
-<ds:datastoreItem xmlns:ds="http://schemas.openxmlformats.org/officeDocument/2006/customXml" ds:itemID="{0AD0403F-4538-4F35-895B-4A73F29FF4F4}">
-  <ds:schemaRefs>
-    <ds:schemaRef ds:uri="http://schemas.microsoft.com/sharepoint/v3/contenttype/forms"/>
-  </ds:schemaRefs>
-</ds:datastoreItem>
-</file>
-
-<file path=customXml/itemProps3.xml><?xml version="1.0" encoding="utf-8"?>
-<ds:datastoreItem xmlns:ds="http://schemas.openxmlformats.org/officeDocument/2006/customXml" ds:itemID="{8B7F66FD-9D04-4EC5-B43D-084D53B4EF9C}">
-  <ds:schemaRefs>
-    <ds:schemaRef ds:uri="http://schemas.microsoft.com/office/2006/metadata/properties"/>
-    <ds:schemaRef ds:uri="http://schemas.microsoft.com/office/infopath/2007/PartnerControls"/>
-  </ds:schemaRefs>
-</ds:datastoreItem>
-</file>
-
 <file path=customXml/itemProps4.xml><?xml version="1.0" encoding="utf-8"?>
 <ds:datastoreItem xmlns:ds="http://schemas.openxmlformats.org/officeDocument/2006/customXml" ds:itemID="{273F679F-9FD1-4033-8859-4F0F279958DA}">
   <ds:schemaRefs>

</xml_diff>

<commit_message>
Revert "Recargar plantilla oficial de LOG-026 y habilitar recarga en modulo de administracion"
This reverts commit 1b3b429c95736fcfb3a523fcb774fa652c643be0.
</commit_message>
<xml_diff>
--- a/LOG-026-Acta de Verificacion y Legalizacion de para bolsa_V1.docx
+++ b/LOG-026-Acta de Verificacion y Legalizacion de para bolsa_V1.docx
@@ -108,6 +108,7 @@
                 <w:iCs/>
                 <w:sz w:val="22"/>
                 <w:szCs w:val="22"/>
+                <w:highlight w:val="red"/>
               </w:rPr>
             </w:pPr>
           </w:p>
@@ -126,6 +127,7 @@
                 <w:iCs/>
                 <w:sz w:val="22"/>
                 <w:szCs w:val="22"/>
+                <w:highlight w:val="red"/>
               </w:rPr>
             </w:pPr>
             <w:r>
@@ -151,6 +153,7 @@
                 <w:iCs/>
                 <w:sz w:val="22"/>
                 <w:szCs w:val="22"/>
+                <w:highlight w:val="red"/>
               </w:rPr>
             </w:pPr>
           </w:p>
@@ -199,6 +202,7 @@
                 <w:iCs/>
                 <w:sz w:val="22"/>
                 <w:szCs w:val="22"/>
+                <w:highlight w:val="red"/>
               </w:rPr>
             </w:pPr>
           </w:p>
@@ -242,6 +246,7 @@
                 <w:iCs/>
                 <w:sz w:val="22"/>
                 <w:szCs w:val="22"/>
+                <w:highlight w:val="red"/>
               </w:rPr>
             </w:pPr>
           </w:p>
@@ -3435,6 +3440,7 @@
                     </w:rPr>
                   </w:pPr>
                   <w:proofErr w:type="spellStart"/>
+                  <w:proofErr w:type="gramStart"/>
                   <w:r>
                     <w:rPr>
                       <w:rFonts w:ascii="Verdana" w:hAnsi="Verdana" w:cs="Arial"/>
@@ -3452,6 +3458,7 @@
                     <w:t>ybohorquez@cpe.gov.co</w:t>
                   </w:r>
                   <w:proofErr w:type="spellEnd"/>
+                  <w:proofErr w:type="gramEnd"/>
                 </w:p>
               </w:tc>
               <w:tc>
@@ -6549,21 +6556,6 @@
 </file>
 
 <file path=customXml/item1.xml><?xml version="1.0" encoding="utf-8"?>
-<p:properties xmlns:p="http://schemas.microsoft.com/office/2006/metadata/properties" xmlns:xsi="http://www.w3.org/2001/XMLSchema-instance" xmlns:pc="http://schemas.microsoft.com/office/infopath/2007/PartnerControls">
-  <documentManagement/>
-</p:properties>
-</file>
-
-<file path=customXml/item2.xml><?xml version="1.0" encoding="utf-8"?>
-<?mso-contentType ?>
-<FormTemplates xmlns="http://schemas.microsoft.com/sharepoint/v3/contenttype/forms">
-  <Display>DocumentLibraryForm</Display>
-  <Edit>DocumentLibraryForm</Edit>
-  <New>DocumentLibraryForm</New>
-</FormTemplates>
-</file>
-
-<file path=customXml/item3.xml><?xml version="1.0" encoding="utf-8"?>
 <ct:contentTypeSchema xmlns:ct="http://schemas.microsoft.com/office/2006/metadata/contentType" xmlns:ma="http://schemas.microsoft.com/office/2006/metadata/properties/metaAttributes" ct:_="" ma:_="" ma:contentTypeName="Document" ma:contentTypeID="0x010100A30B331C4838804993200D47FCE41471" ma:contentTypeVersion="11" ma:contentTypeDescription="Create a new document." ma:contentTypeScope="" ma:versionID="d9801eb647fd58e56a8b175437891573">
   <xsd:schema xmlns:xsd="http://www.w3.org/2001/XMLSchema" xmlns:xs="http://www.w3.org/2001/XMLSchema" xmlns:p="http://schemas.microsoft.com/office/2006/metadata/properties" xmlns:ns3="2e532581-20e9-408c-a3d6-754b6c32e08b" xmlns:ns4="ab9f0e5a-eb09-4b64-a8eb-5db8af803633" targetNamespace="http://schemas.microsoft.com/office/2006/metadata/properties" ma:root="true" ma:fieldsID="c3d21b39ec3e984babe6119bab9014b0" ns3:_="" ns4:_="">
     <xsd:import namespace="2e532581-20e9-408c-a3d6-754b6c32e08b"/>
@@ -6772,28 +6764,26 @@
 </ct:contentTypeSchema>
 </file>
 
+<file path=customXml/item2.xml><?xml version="1.0" encoding="utf-8"?>
+<?mso-contentType ?>
+<FormTemplates xmlns="http://schemas.microsoft.com/sharepoint/v3/contenttype/forms">
+  <Display>DocumentLibraryForm</Display>
+  <Edit>DocumentLibraryForm</Edit>
+  <New>DocumentLibraryForm</New>
+</FormTemplates>
+</file>
+
+<file path=customXml/item3.xml><?xml version="1.0" encoding="utf-8"?>
+<p:properties xmlns:p="http://schemas.microsoft.com/office/2006/metadata/properties" xmlns:xsi="http://www.w3.org/2001/XMLSchema-instance" xmlns:pc="http://schemas.microsoft.com/office/infopath/2007/PartnerControls">
+  <documentManagement/>
+</p:properties>
+</file>
+
 <file path=customXml/item4.xml><?xml version="1.0" encoding="utf-8"?>
 <b:Sources xmlns:b="http://schemas.openxmlformats.org/officeDocument/2006/bibliography" xmlns="http://schemas.openxmlformats.org/officeDocument/2006/bibliography" SelectedStyle="\APASixthEditionOfficeOnline.xsl" StyleName="APA" Version="6"/>
 </file>
 
 <file path=customXml/itemProps1.xml><?xml version="1.0" encoding="utf-8"?>
-<ds:datastoreItem xmlns:ds="http://schemas.openxmlformats.org/officeDocument/2006/customXml" ds:itemID="{8B7F66FD-9D04-4EC5-B43D-084D53B4EF9C}">
-  <ds:schemaRefs>
-    <ds:schemaRef ds:uri="http://schemas.microsoft.com/office/2006/metadata/properties"/>
-    <ds:schemaRef ds:uri="http://schemas.microsoft.com/office/infopath/2007/PartnerControls"/>
-  </ds:schemaRefs>
-</ds:datastoreItem>
-</file>
-
-<file path=customXml/itemProps2.xml><?xml version="1.0" encoding="utf-8"?>
-<ds:datastoreItem xmlns:ds="http://schemas.openxmlformats.org/officeDocument/2006/customXml" ds:itemID="{0AD0403F-4538-4F35-895B-4A73F29FF4F4}">
-  <ds:schemaRefs>
-    <ds:schemaRef ds:uri="http://schemas.microsoft.com/sharepoint/v3/contenttype/forms"/>
-  </ds:schemaRefs>
-</ds:datastoreItem>
-</file>
-
-<file path=customXml/itemProps3.xml><?xml version="1.0" encoding="utf-8"?>
 <ds:datastoreItem xmlns:ds="http://schemas.openxmlformats.org/officeDocument/2006/customXml" ds:itemID="{36349CA1-45D6-4016-A788-A8C5D419407B}">
   <ds:schemaRefs>
     <ds:schemaRef ds:uri="http://schemas.microsoft.com/office/2006/metadata/contentType"/>
@@ -6812,6 +6802,23 @@
 </ds:datastoreItem>
 </file>
 
+<file path=customXml/itemProps2.xml><?xml version="1.0" encoding="utf-8"?>
+<ds:datastoreItem xmlns:ds="http://schemas.openxmlformats.org/officeDocument/2006/customXml" ds:itemID="{0AD0403F-4538-4F35-895B-4A73F29FF4F4}">
+  <ds:schemaRefs>
+    <ds:schemaRef ds:uri="http://schemas.microsoft.com/sharepoint/v3/contenttype/forms"/>
+  </ds:schemaRefs>
+</ds:datastoreItem>
+</file>
+
+<file path=customXml/itemProps3.xml><?xml version="1.0" encoding="utf-8"?>
+<ds:datastoreItem xmlns:ds="http://schemas.openxmlformats.org/officeDocument/2006/customXml" ds:itemID="{8B7F66FD-9D04-4EC5-B43D-084D53B4EF9C}">
+  <ds:schemaRefs>
+    <ds:schemaRef ds:uri="http://schemas.microsoft.com/office/2006/metadata/properties"/>
+    <ds:schemaRef ds:uri="http://schemas.microsoft.com/office/infopath/2007/PartnerControls"/>
+  </ds:schemaRefs>
+</ds:datastoreItem>
+</file>
+
 <file path=customXml/itemProps4.xml><?xml version="1.0" encoding="utf-8"?>
 <ds:datastoreItem xmlns:ds="http://schemas.openxmlformats.org/officeDocument/2006/customXml" ds:itemID="{273F679F-9FD1-4033-8859-4F0F279958DA}">
   <ds:schemaRefs>

</xml_diff>

<commit_message>
Actualizar plantilla oficial LOG-026-F con datos oficiales del contratista
</commit_message>
<xml_diff>
--- a/LOG-026-Acta de Verificacion y Legalizacion de para bolsa_V1.docx
+++ b/LOG-026-Acta de Verificacion y Legalizacion de para bolsa_V1.docx
@@ -108,7 +108,6 @@
                 <w:iCs/>
                 <w:sz w:val="22"/>
                 <w:szCs w:val="22"/>
-                <w:highlight w:val="red"/>
               </w:rPr>
             </w:pPr>
           </w:p>
@@ -127,7 +126,6 @@
                 <w:iCs/>
                 <w:sz w:val="22"/>
                 <w:szCs w:val="22"/>
-                <w:highlight w:val="red"/>
               </w:rPr>
             </w:pPr>
             <w:r>
@@ -153,7 +151,6 @@
                 <w:iCs/>
                 <w:sz w:val="22"/>
                 <w:szCs w:val="22"/>
-                <w:highlight w:val="red"/>
               </w:rPr>
             </w:pPr>
           </w:p>
@@ -202,7 +199,6 @@
                 <w:iCs/>
                 <w:sz w:val="22"/>
                 <w:szCs w:val="22"/>
-                <w:highlight w:val="red"/>
               </w:rPr>
             </w:pPr>
           </w:p>
@@ -246,7 +242,6 @@
                 <w:iCs/>
                 <w:sz w:val="22"/>
                 <w:szCs w:val="22"/>
-                <w:highlight w:val="red"/>
               </w:rPr>
             </w:pPr>
           </w:p>
@@ -1156,23 +1151,123 @@
                 <w:sz w:val="22"/>
                 <w:szCs w:val="22"/>
               </w:rPr>
-              <w:t>, se reunieron de una parte, el señor(a) ____________________________________en su calidad de rector (a) y de la otra el señor</w:t>
-            </w:r>
-            <w:r>
-              <w:rPr>
-                <w:rFonts w:ascii="Verdana" w:hAnsi="Verdana" w:cs="Arial"/>
-                <w:sz w:val="22"/>
-                <w:szCs w:val="22"/>
-              </w:rPr>
-              <w:t>(a)</w:t>
-            </w:r>
-            <w:r>
-              <w:rPr>
-                <w:rFonts w:ascii="Verdana" w:hAnsi="Verdana" w:cs="Arial"/>
-                <w:sz w:val="22"/>
-                <w:szCs w:val="22"/>
-              </w:rPr>
-              <w:t xml:space="preserve"> __________________________________________en su calidad de _______________________________ en </w:t>
+              <w:t>, se reunieron de una parte, el señor(a) _</w:t>
+            </w:r>
+            <w:r>
+              <w:rPr>
+                <w:rFonts w:ascii="Verdana" w:hAnsi="Verdana" w:cs="Arial"/>
+                <w:sz w:val="22"/>
+                <w:szCs w:val="22"/>
+              </w:rPr>
+              <w:t xml:space="preserve"> </w:t>
+            </w:r>
+            <w:r>
+              <w:rPr>
+                <w:rFonts w:ascii="Verdana" w:hAnsi="Verdana" w:cs="Arial"/>
+                <w:sz w:val="22"/>
+                <w:szCs w:val="22"/>
+              </w:rPr>
+              <w:t>___________________________________en su calidad de rector (a) y de la otra el señor</w:t>
+            </w:r>
+            <w:r>
+              <w:rPr>
+                <w:rFonts w:ascii="Verdana" w:hAnsi="Verdana" w:cs="Arial"/>
+                <w:sz w:val="22"/>
+                <w:szCs w:val="22"/>
+              </w:rPr>
+              <w:t>(</w:t>
+            </w:r>
+            <w:proofErr w:type="gramStart"/>
+            <w:r>
+              <w:rPr>
+                <w:rFonts w:ascii="Verdana" w:hAnsi="Verdana" w:cs="Arial"/>
+                <w:sz w:val="22"/>
+                <w:szCs w:val="22"/>
+              </w:rPr>
+              <w:t>a)</w:t>
+            </w:r>
+            <w:r>
+              <w:rPr>
+                <w:rFonts w:ascii="Verdana" w:hAnsi="Verdana" w:cs="Arial"/>
+                <w:sz w:val="22"/>
+                <w:szCs w:val="22"/>
+              </w:rPr>
+              <w:t xml:space="preserve"> </w:t>
+            </w:r>
+            <w:r>
+              <w:rPr>
+                <w:rFonts w:ascii="Verdana" w:hAnsi="Verdana" w:cs="Arial"/>
+                <w:sz w:val="22"/>
+                <w:szCs w:val="22"/>
+              </w:rPr>
+              <w:t xml:space="preserve"> YUBY</w:t>
+            </w:r>
+            <w:proofErr w:type="gramEnd"/>
+            <w:r>
+              <w:rPr>
+                <w:rFonts w:ascii="Verdana" w:hAnsi="Verdana" w:cs="Arial"/>
+                <w:sz w:val="22"/>
+                <w:szCs w:val="22"/>
+              </w:rPr>
+              <w:t xml:space="preserve"> CATERINE BOHÓRQUEZ ROJAS </w:t>
+            </w:r>
+            <w:r>
+              <w:rPr>
+                <w:rFonts w:ascii="Verdana" w:hAnsi="Verdana" w:cs="Arial"/>
+                <w:sz w:val="22"/>
+                <w:szCs w:val="22"/>
+              </w:rPr>
+              <w:t>en su calidad de</w:t>
+            </w:r>
+            <w:r>
+              <w:rPr>
+                <w:rFonts w:ascii="Verdana" w:hAnsi="Verdana" w:cs="Arial"/>
+                <w:sz w:val="22"/>
+                <w:szCs w:val="22"/>
+              </w:rPr>
+              <w:t xml:space="preserve"> </w:t>
+            </w:r>
+            <w:r>
+              <w:rPr>
+                <w:rFonts w:ascii="Verdana" w:hAnsi="Verdana" w:cs="Arial"/>
+                <w:sz w:val="22"/>
+                <w:szCs w:val="22"/>
+              </w:rPr>
+              <w:t xml:space="preserve">PROFESIONAL </w:t>
+            </w:r>
+            <w:proofErr w:type="gramStart"/>
+            <w:r>
+              <w:rPr>
+                <w:rFonts w:ascii="Verdana" w:hAnsi="Verdana" w:cs="Arial"/>
+                <w:sz w:val="22"/>
+                <w:szCs w:val="22"/>
+              </w:rPr>
+              <w:t>LOGÍSTICA</w:t>
+            </w:r>
+            <w:r>
+              <w:rPr>
+                <w:rFonts w:ascii="Verdana" w:hAnsi="Verdana" w:cs="Arial"/>
+                <w:sz w:val="22"/>
+                <w:szCs w:val="22"/>
+              </w:rPr>
+              <w:t xml:space="preserve"> </w:t>
+            </w:r>
+            <w:r>
+              <w:rPr>
+                <w:rFonts w:ascii="Verdana" w:hAnsi="Verdana" w:cs="Arial"/>
+                <w:sz w:val="22"/>
+                <w:szCs w:val="22"/>
+              </w:rPr>
+              <w:t xml:space="preserve"> en</w:t>
+            </w:r>
+            <w:proofErr w:type="gramEnd"/>
+            <w:r>
+              <w:rPr>
+                <w:rFonts w:ascii="Verdana" w:hAnsi="Verdana" w:cs="Arial"/>
+                <w:sz w:val="22"/>
+                <w:szCs w:val="22"/>
+              </w:rPr>
+              <w:t xml:space="preserve"> </w:t>
             </w:r>
             <w:r>
               <w:rPr>
@@ -1447,35 +1542,26 @@
                 <w:szCs w:val="20"/>
                 <w:lang w:val="es-CO"/>
               </w:rPr>
-              <w:t xml:space="preserve">En consecuencia, será responsabilidad de la Institución Educativa y/o sede contratar y mantener vigentes las pólizas de seguro y/o garantías que considere necesarias para amparar los bienes entregados frente a eventos tales como </w:t>
-            </w:r>
-            <w:r>
+              <w:t>En consecuencia, será responsabilidad de la Institución Educativa y/o sede contratar y mantener vigentes las pólizas de seguro y/o garantías que considere necesarias para amparar los bienes entregados frente a eventos tales como pérdida, hurto, daño, destrucción o afectaciones derivadas de desastres naturales, entre otros riesgos que puedan comprometer su integridad o funcionamiento.</w:t>
+            </w:r>
+          </w:p>
+          <w:p>
+            <w:pPr>
+              <w:jc w:val="both"/>
               <w:rPr>
                 <w:rFonts w:ascii="Verdana" w:eastAsia="Yu Gothic UI Semilight" w:hAnsi="Verdana" w:cs="Arial"/>
                 <w:sz w:val="20"/>
                 <w:szCs w:val="20"/>
                 <w:lang w:val="es-CO"/>
               </w:rPr>
+            </w:pPr>
+            <w:r>
+              <w:rPr>
+                <w:rFonts w:ascii="Verdana" w:eastAsia="Yu Gothic UI Semilight" w:hAnsi="Verdana" w:cs="Arial"/>
+                <w:sz w:val="20"/>
+                <w:szCs w:val="20"/>
+              </w:rPr>
               <w:lastRenderedPageBreak/>
-              <w:t>pérdida, hurto, daño, destrucción o afectaciones derivadas de desastres naturales, entre otros riesgos que puedan comprometer su integridad o funcionamiento.</w:t>
-            </w:r>
-          </w:p>
-          <w:p>
-            <w:pPr>
-              <w:jc w:val="both"/>
-              <w:rPr>
-                <w:rFonts w:ascii="Verdana" w:eastAsia="Yu Gothic UI Semilight" w:hAnsi="Verdana" w:cs="Arial"/>
-                <w:sz w:val="20"/>
-                <w:szCs w:val="20"/>
-                <w:lang w:val="es-CO"/>
-              </w:rPr>
-            </w:pPr>
-            <w:r>
-              <w:rPr>
-                <w:rFonts w:ascii="Verdana" w:eastAsia="Yu Gothic UI Semilight" w:hAnsi="Verdana" w:cs="Arial"/>
-                <w:sz w:val="20"/>
-                <w:szCs w:val="20"/>
-              </w:rPr>
               <w:t>Se deja expresamente establecido que los eventos anteriormente señalados no se encuentran cubiertos por la garantía otorgada por la Asociación Computadores para Educar.</w:t>
             </w:r>
           </w:p>
@@ -2108,7 +2194,25 @@
                 <w:sz w:val="20"/>
                 <w:szCs w:val="20"/>
               </w:rPr>
-              <w:t xml:space="preserve">e tener en cuenta las siguientes excepciones para que la garantía se pueda aplicar: cuando el periodo de garantía haya expirado; sea cualquiera el tiempo transcurrido después de la fecha de terminación de la garantía; mal manejo o manipulación de las terminales efectuada por parte del usuario o de terceros no autorizados, así como modificaciones o ampliaciones posteriores no incluidas en la configuración original; daños del sistema operativo ocasionados por instalación de software adicional o por utilización incorrecta del mismo; daños ocasionados por virus informáticos o pérdidas de información; todo tipo de problemas ocasionados por  instalación de periféricos o software adquiridos a terceros, que presenten incompatibilidades; daños causados por desastres naturales (rayos, </w:t>
+              <w:t xml:space="preserve">e tener en cuenta las siguientes excepciones para que la garantía se pueda aplicar: cuando el periodo de garantía haya expirado; sea cualquiera el tiempo transcurrido después de la fecha de terminación de la garantía; mal manejo o manipulación de las terminales efectuada por parte del usuario o de terceros no autorizados, así como modificaciones o ampliaciones posteriores no incluidas en la configuración original; daños del sistema operativo ocasionados por instalación de software adicional o por utilización incorrecta del mismo; daños ocasionados por virus informáticos o pérdidas de información; todo tipo de problemas ocasionados por  instalación de periféricos o software adquiridos a terceros, que presenten incompatibilidades; daños causados por desastres naturales (rayos, terremotos) </w:t>
+            </w:r>
+            <w:proofErr w:type="spellStart"/>
+            <w:r>
+              <w:rPr>
+                <w:rFonts w:ascii="Verdana" w:eastAsia="Yu Gothic UI Semilight" w:hAnsi="Verdana" w:cs="Arial"/>
+                <w:sz w:val="20"/>
+                <w:szCs w:val="20"/>
+              </w:rPr>
+              <w:t>ó</w:t>
+            </w:r>
+            <w:proofErr w:type="spellEnd"/>
+            <w:r>
+              <w:rPr>
+                <w:rFonts w:ascii="Verdana" w:eastAsia="Yu Gothic UI Semilight" w:hAnsi="Verdana" w:cs="Arial"/>
+                <w:sz w:val="20"/>
+                <w:szCs w:val="20"/>
+              </w:rPr>
+              <w:t xml:space="preserve"> accidentes diversos como incendios, inundaciones, entre otros; daños como oxidación o sulfatación de partes internas de las terminales ocasionados por condiciones climáticas inadecuadas en el aula que no </w:t>
             </w:r>
             <w:r>
               <w:rPr>
@@ -2117,25 +2221,7 @@
                 <w:szCs w:val="20"/>
               </w:rPr>
               <w:lastRenderedPageBreak/>
-              <w:t xml:space="preserve">terremotos) </w:t>
-            </w:r>
-            <w:proofErr w:type="spellStart"/>
-            <w:r>
-              <w:rPr>
-                <w:rFonts w:ascii="Verdana" w:eastAsia="Yu Gothic UI Semilight" w:hAnsi="Verdana" w:cs="Arial"/>
-                <w:sz w:val="20"/>
-                <w:szCs w:val="20"/>
-              </w:rPr>
-              <w:t>ó</w:t>
-            </w:r>
-            <w:proofErr w:type="spellEnd"/>
-            <w:r>
-              <w:rPr>
-                <w:rFonts w:ascii="Verdana" w:eastAsia="Yu Gothic UI Semilight" w:hAnsi="Verdana" w:cs="Arial"/>
-                <w:sz w:val="20"/>
-                <w:szCs w:val="20"/>
-              </w:rPr>
-              <w:t xml:space="preserve"> accidentes diversos como incendios, inundaciones, entre otros; daños como oxidación o sulfatación de partes internas de las terminales ocasionados por condiciones climáticas inadecuadas en el aula que no garanticen la preservación y cuidado de los mismos; daños ocasionados por causas externas como accidentes (golpes), derrame de bebidas o alimentos sobre las terminales, problemas con el suministro de energía (sobrevoltajes), maltrato y situaciones similares; daños ocasionados por el mal embalaje de las terminales  al momento de remitirlos por Garantía a Computadores para Educar. La superficie o plataforma de impresión de la impresora 3D no tiene garantía.</w:t>
+              <w:t>garanticen la preservación y cuidado de los mismos; daños ocasionados por causas externas como accidentes (golpes), derrame de bebidas o alimentos sobre las terminales, problemas con el suministro de energía (sobrevoltajes), maltrato y situaciones similares; daños ocasionados por el mal embalaje de las terminales  al momento de remitirlos por Garantía a Computadores para Educar. La superficie o plataforma de impresión de la impresora 3D no tiene garantía.</w:t>
             </w:r>
           </w:p>
           <w:p>
@@ -2506,18 +2592,7 @@
             <w:pPr>
               <w:rPr>
                 <w:rFonts w:ascii="Verdana" w:hAnsi="Verdana"/>
-                <w:b/>
-                <w:color w:val="000000"/>
-                <w:sz w:val="22"/>
-                <w:szCs w:val="22"/>
-              </w:rPr>
-            </w:pPr>
-          </w:p>
-          <w:p>
-            <w:pPr>
-              <w:rPr>
-                <w:rFonts w:ascii="Verdana" w:hAnsi="Verdana"/>
-                <w:b/>
+                <w:bCs/>
                 <w:color w:val="000000"/>
                 <w:sz w:val="22"/>
                 <w:szCs w:val="22"/>
@@ -2839,7 +2914,6 @@
                 <w:sz w:val="22"/>
                 <w:szCs w:val="22"/>
               </w:rPr>
-              <w:lastRenderedPageBreak/>
               <w:t>FIRMAS</w:t>
             </w:r>
           </w:p>
@@ -2919,34 +2993,6 @@
                 <w:szCs w:val="22"/>
               </w:rPr>
             </w:pPr>
-          </w:p>
-          <w:p>
-            <w:pPr>
-              <w:tabs>
-                <w:tab w:val="left" w:pos="1741"/>
-              </w:tabs>
-              <w:rPr>
-                <w:rFonts w:ascii="Verdana" w:hAnsi="Verdana" w:cs="Arial"/>
-                <w:b/>
-                <w:bCs/>
-                <w:sz w:val="22"/>
-                <w:szCs w:val="22"/>
-              </w:rPr>
-            </w:pPr>
-          </w:p>
-          <w:p>
-            <w:pPr>
-              <w:tabs>
-                <w:tab w:val="left" w:pos="1741"/>
-              </w:tabs>
-              <w:rPr>
-                <w:rFonts w:ascii="Verdana" w:hAnsi="Verdana" w:cs="Arial"/>
-                <w:b/>
-                <w:bCs/>
-                <w:sz w:val="22"/>
-                <w:szCs w:val="22"/>
-              </w:rPr>
-            </w:pPr>
             <w:r>
               <w:rPr>
                 <w:rFonts w:ascii="Verdana" w:hAnsi="Verdana" w:cs="Arial"/>
@@ -2956,10 +3002,19 @@
                 <w:sz w:val="22"/>
                 <w:szCs w:val="22"/>
               </w:rPr>
+              <w:lastRenderedPageBreak/>
               <w:drawing>
-                <wp:inline distT="0" distB="0" distL="0" distR="0" wp14:anchorId="6CAC8BE3" wp14:editId="206115C6">
-                  <wp:extent cx="952018" cy="452146"/>
-                  <wp:effectExtent l="0" t="0" r="635" b="5080"/>
+                <wp:anchor distT="0" distB="0" distL="114300" distR="114300" simplePos="0" relativeHeight="251670528" behindDoc="1" locked="0" layoutInCell="1" allowOverlap="1" wp14:anchorId="6CAC8BE3" wp14:editId="1F51F1E7">
+                  <wp:simplePos x="0" y="0"/>
+                  <wp:positionH relativeFrom="column">
+                    <wp:posOffset>381635</wp:posOffset>
+                  </wp:positionH>
+                  <wp:positionV relativeFrom="paragraph">
+                    <wp:posOffset>97155</wp:posOffset>
+                  </wp:positionV>
+                  <wp:extent cx="1822450" cy="865505"/>
+                  <wp:effectExtent l="0" t="0" r="6350" b="0"/>
+                  <wp:wrapNone/>
                   <wp:docPr id="552010827" name="Imagen 3"/>
                   <wp:cNvGraphicFramePr>
                     <a:graphicFrameLocks xmlns:a="http://schemas.openxmlformats.org/drawingml/2006/main" noChangeAspect="1"/>
@@ -2986,7 +3041,7 @@
                         <pic:spPr>
                           <a:xfrm>
                             <a:off x="0" y="0"/>
-                            <a:ext cx="960613" cy="456228"/>
+                            <a:ext cx="1822450" cy="865505"/>
                           </a:xfrm>
                           <a:prstGeom prst="rect">
                             <a:avLst/>
@@ -2995,9 +3050,43 @@
                       </pic:pic>
                     </a:graphicData>
                   </a:graphic>
-                </wp:inline>
+                  <wp14:sizeRelH relativeFrom="page">
+                    <wp14:pctWidth>0</wp14:pctWidth>
+                  </wp14:sizeRelH>
+                  <wp14:sizeRelV relativeFrom="page">
+                    <wp14:pctHeight>0</wp14:pctHeight>
+                  </wp14:sizeRelV>
+                </wp:anchor>
               </w:drawing>
             </w:r>
+          </w:p>
+          <w:p>
+            <w:pPr>
+              <w:tabs>
+                <w:tab w:val="left" w:pos="1741"/>
+              </w:tabs>
+              <w:rPr>
+                <w:rFonts w:ascii="Verdana" w:hAnsi="Verdana" w:cs="Arial"/>
+                <w:b/>
+                <w:bCs/>
+                <w:sz w:val="22"/>
+                <w:szCs w:val="22"/>
+              </w:rPr>
+            </w:pPr>
+          </w:p>
+          <w:p>
+            <w:pPr>
+              <w:tabs>
+                <w:tab w:val="left" w:pos="1741"/>
+              </w:tabs>
+              <w:rPr>
+                <w:rFonts w:ascii="Verdana" w:hAnsi="Verdana" w:cs="Arial"/>
+                <w:b/>
+                <w:bCs/>
+                <w:sz w:val="22"/>
+                <w:szCs w:val="22"/>
+              </w:rPr>
+            </w:pPr>
           </w:p>
           <w:p>
             <w:pPr>
@@ -3539,7 +3628,7 @@
                       <w:sz w:val="20"/>
                       <w:szCs w:val="20"/>
                     </w:rPr>
-                    <w:t>profesional logístico</w:t>
+                    <w:t>PROFESIONAL LOGÍSTICO</w:t>
                   </w:r>
                 </w:p>
               </w:tc>
@@ -3729,6 +3818,7 @@
                 <w:sz w:val="20"/>
                 <w:szCs w:val="20"/>
               </w:rPr>
+              <w:lastRenderedPageBreak/>
               <w:t>REGISTRO FOTOGRÁFICO (Mínimo dos fotografías)</w:t>
             </w:r>
           </w:p>
@@ -3770,7 +3860,6 @@
                 <w:sz w:val="22"/>
                 <w:szCs w:val="22"/>
               </w:rPr>
-              <w:lastRenderedPageBreak/>
               <mc:AlternateContent>
                 <mc:Choice Requires="wps">
                   <w:drawing>
@@ -4282,6 +4371,7 @@
                 <w:szCs w:val="18"/>
                 <w:lang w:val="pt-PT"/>
               </w:rPr>
+              <w:lastRenderedPageBreak/>
               <w:t>CONTROL DE CAMBIOS</w:t>
             </w:r>
           </w:p>
@@ -6556,6 +6646,15 @@
 </file>
 
 <file path=customXml/item1.xml><?xml version="1.0" encoding="utf-8"?>
+<?mso-contentType ?>
+<FormTemplates xmlns="http://schemas.microsoft.com/sharepoint/v3/contenttype/forms">
+  <Display>DocumentLibraryForm</Display>
+  <Edit>DocumentLibraryForm</Edit>
+  <New>DocumentLibraryForm</New>
+</FormTemplates>
+</file>
+
+<file path=customXml/item2.xml><?xml version="1.0" encoding="utf-8"?>
 <ct:contentTypeSchema xmlns:ct="http://schemas.microsoft.com/office/2006/metadata/contentType" xmlns:ma="http://schemas.microsoft.com/office/2006/metadata/properties/metaAttributes" ct:_="" ma:_="" ma:contentTypeName="Document" ma:contentTypeID="0x010100A30B331C4838804993200D47FCE41471" ma:contentTypeVersion="11" ma:contentTypeDescription="Create a new document." ma:contentTypeScope="" ma:versionID="d9801eb647fd58e56a8b175437891573">
   <xsd:schema xmlns:xsd="http://www.w3.org/2001/XMLSchema" xmlns:xs="http://www.w3.org/2001/XMLSchema" xmlns:p="http://schemas.microsoft.com/office/2006/metadata/properties" xmlns:ns3="2e532581-20e9-408c-a3d6-754b6c32e08b" xmlns:ns4="ab9f0e5a-eb09-4b64-a8eb-5db8af803633" targetNamespace="http://schemas.microsoft.com/office/2006/metadata/properties" ma:root="true" ma:fieldsID="c3d21b39ec3e984babe6119bab9014b0" ns3:_="" ns4:_="">
     <xsd:import namespace="2e532581-20e9-408c-a3d6-754b6c32e08b"/>
@@ -6764,26 +6863,25 @@
 </ct:contentTypeSchema>
 </file>
 
-<file path=customXml/item2.xml><?xml version="1.0" encoding="utf-8"?>
-<?mso-contentType ?>
-<FormTemplates xmlns="http://schemas.microsoft.com/sharepoint/v3/contenttype/forms">
-  <Display>DocumentLibraryForm</Display>
-  <Edit>DocumentLibraryForm</Edit>
-  <New>DocumentLibraryForm</New>
-</FormTemplates>
+<file path=customXml/item3.xml><?xml version="1.0" encoding="utf-8"?>
+<b:Sources xmlns:b="http://schemas.openxmlformats.org/officeDocument/2006/bibliography" xmlns="http://schemas.openxmlformats.org/officeDocument/2006/bibliography" SelectedStyle="\APASixthEditionOfficeOnline.xsl" StyleName="APA" Version="6"/>
 </file>
 
-<file path=customXml/item3.xml><?xml version="1.0" encoding="utf-8"?>
+<file path=customXml/item4.xml><?xml version="1.0" encoding="utf-8"?>
 <p:properties xmlns:p="http://schemas.microsoft.com/office/2006/metadata/properties" xmlns:xsi="http://www.w3.org/2001/XMLSchema-instance" xmlns:pc="http://schemas.microsoft.com/office/infopath/2007/PartnerControls">
   <documentManagement/>
 </p:properties>
 </file>
 
-<file path=customXml/item4.xml><?xml version="1.0" encoding="utf-8"?>
-<b:Sources xmlns:b="http://schemas.openxmlformats.org/officeDocument/2006/bibliography" xmlns="http://schemas.openxmlformats.org/officeDocument/2006/bibliography" SelectedStyle="\APASixthEditionOfficeOnline.xsl" StyleName="APA" Version="6"/>
+<file path=customXml/itemProps1.xml><?xml version="1.0" encoding="utf-8"?>
+<ds:datastoreItem xmlns:ds="http://schemas.openxmlformats.org/officeDocument/2006/customXml" ds:itemID="{0AD0403F-4538-4F35-895B-4A73F29FF4F4}">
+  <ds:schemaRefs>
+    <ds:schemaRef ds:uri="http://schemas.microsoft.com/sharepoint/v3/contenttype/forms"/>
+  </ds:schemaRefs>
+</ds:datastoreItem>
 </file>
 
-<file path=customXml/itemProps1.xml><?xml version="1.0" encoding="utf-8"?>
+<file path=customXml/itemProps2.xml><?xml version="1.0" encoding="utf-8"?>
 <ds:datastoreItem xmlns:ds="http://schemas.openxmlformats.org/officeDocument/2006/customXml" ds:itemID="{36349CA1-45D6-4016-A788-A8C5D419407B}">
   <ds:schemaRefs>
     <ds:schemaRef ds:uri="http://schemas.microsoft.com/office/2006/metadata/contentType"/>
@@ -6802,27 +6900,19 @@
 </ds:datastoreItem>
 </file>
 
-<file path=customXml/itemProps2.xml><?xml version="1.0" encoding="utf-8"?>
-<ds:datastoreItem xmlns:ds="http://schemas.openxmlformats.org/officeDocument/2006/customXml" ds:itemID="{0AD0403F-4538-4F35-895B-4A73F29FF4F4}">
+<file path=customXml/itemProps3.xml><?xml version="1.0" encoding="utf-8"?>
+<ds:datastoreItem xmlns:ds="http://schemas.openxmlformats.org/officeDocument/2006/customXml" ds:itemID="{273F679F-9FD1-4033-8859-4F0F279958DA}">
   <ds:schemaRefs>
-    <ds:schemaRef ds:uri="http://schemas.microsoft.com/sharepoint/v3/contenttype/forms"/>
+    <ds:schemaRef ds:uri="http://schemas.openxmlformats.org/officeDocument/2006/bibliography"/>
   </ds:schemaRefs>
 </ds:datastoreItem>
 </file>
 
-<file path=customXml/itemProps3.xml><?xml version="1.0" encoding="utf-8"?>
+<file path=customXml/itemProps4.xml><?xml version="1.0" encoding="utf-8"?>
 <ds:datastoreItem xmlns:ds="http://schemas.openxmlformats.org/officeDocument/2006/customXml" ds:itemID="{8B7F66FD-9D04-4EC5-B43D-084D53B4EF9C}">
   <ds:schemaRefs>
     <ds:schemaRef ds:uri="http://schemas.microsoft.com/office/2006/metadata/properties"/>
     <ds:schemaRef ds:uri="http://schemas.microsoft.com/office/infopath/2007/PartnerControls"/>
   </ds:schemaRefs>
 </ds:datastoreItem>
-</file>
-
-<file path=customXml/itemProps4.xml><?xml version="1.0" encoding="utf-8"?>
-<ds:datastoreItem xmlns:ds="http://schemas.openxmlformats.org/officeDocument/2006/customXml" ds:itemID="{273F679F-9FD1-4033-8859-4F0F279958DA}">
-  <ds:schemaRefs>
-    <ds:schemaRef ds:uri="http://schemas.openxmlformats.org/officeDocument/2006/bibliography"/>
-  </ds:schemaRefs>
-</ds:datastoreItem>
 </file>
</xml_diff>

<commit_message>
Actualizar plantilla LOG-026-F con radicado sede en encabezado y fijar anchos de columnas para respetar margenes
</commit_message>
<xml_diff>
--- a/LOG-026-Acta de Verificacion y Legalizacion de para bolsa_V1.docx
+++ b/LOG-026-Acta de Verificacion y Legalizacion de para bolsa_V1.docx
@@ -4,7 +4,8 @@
   <w:body>
     <w:tbl>
       <w:tblPr>
-        <w:tblW w:w="6620" w:type="pct"/>
+        <w:tblW w:w="8838" w:type="dxa"/>
+        <w:tblLayout w:type="fixed"/>
         <w:jc w:val="center"/>
         <w:tblBorders>
           <w:top w:val="single" w:sz="4" w:space="0" w:color="BFBFBF" w:themeColor="background1" w:themeShade="BF"/>
@@ -22,12 +23,12 @@
         <w:tblLook w:val="0000" w:firstRow="0" w:lastRow="0" w:firstColumn="0" w:lastColumn="0" w:noHBand="0" w:noVBand="0"/>
       </w:tblPr>
       <w:tblGrid>
-        <w:gridCol w:w="3156"/>
-        <w:gridCol w:w="2041"/>
-        <w:gridCol w:w="1307"/>
-        <w:gridCol w:w="1145"/>
-        <w:gridCol w:w="1281"/>
-        <w:gridCol w:w="2758"/>
+        <w:gridCol w:w="2387"/>
+        <w:gridCol w:w="1544"/>
+        <w:gridCol w:w="989"/>
+        <w:gridCol w:w="866"/>
+        <w:gridCol w:w="969"/>
+        <w:gridCol w:w="2083"/>
       </w:tblGrid>
       <w:tr>
         <w:trPr>
@@ -1151,7 +1152,15 @@
                 <w:sz w:val="22"/>
                 <w:szCs w:val="22"/>
               </w:rPr>
-              <w:t>, se reunieron de una parte, el señor(a) _</w:t>
+              <w:t>, se reunieron de una parte, el señor(a) ____________________________________en su calidad de rector (a) y de la otra el señor</w:t>
+            </w:r>
+            <w:r>
+              <w:rPr>
+                <w:rFonts w:ascii="Verdana" w:hAnsi="Verdana" w:cs="Arial"/>
+                <w:sz w:val="22"/>
+                <w:szCs w:val="22"/>
+              </w:rPr>
+              <w:t>(a)</w:t>
             </w:r>
             <w:r>
               <w:rPr>
@@ -1166,25 +1175,9 @@
                 <w:rFonts w:ascii="Verdana" w:hAnsi="Verdana" w:cs="Arial"/>
                 <w:sz w:val="22"/>
                 <w:szCs w:val="22"/>
-              </w:rPr>
-              <w:t>___________________________________en su calidad de rector (a) y de la otra el señor</w:t>
-            </w:r>
-            <w:r>
-              <w:rPr>
-                <w:rFonts w:ascii="Verdana" w:hAnsi="Verdana" w:cs="Arial"/>
-                <w:sz w:val="22"/>
-                <w:szCs w:val="22"/>
-              </w:rPr>
-              <w:t>(</w:t>
-            </w:r>
-            <w:proofErr w:type="gramStart"/>
-            <w:r>
-              <w:rPr>
-                <w:rFonts w:ascii="Verdana" w:hAnsi="Verdana" w:cs="Arial"/>
-                <w:sz w:val="22"/>
-                <w:szCs w:val="22"/>
-              </w:rPr>
-              <w:t>a)</w:t>
+                <w:u w:val="single"/>
+              </w:rPr>
+              <w:t>YUBY CATERINE BOHÓRQUEZ ROJAS</w:t>
             </w:r>
             <w:r>
               <w:rPr>
@@ -1200,23 +1193,6 @@
                 <w:sz w:val="22"/>
                 <w:szCs w:val="22"/>
               </w:rPr>
-              <w:t xml:space="preserve"> YUBY</w:t>
-            </w:r>
-            <w:proofErr w:type="gramEnd"/>
-            <w:r>
-              <w:rPr>
-                <w:rFonts w:ascii="Verdana" w:hAnsi="Verdana" w:cs="Arial"/>
-                <w:sz w:val="22"/>
-                <w:szCs w:val="22"/>
-              </w:rPr>
-              <w:t xml:space="preserve"> CATERINE BOHÓRQUEZ ROJAS </w:t>
-            </w:r>
-            <w:r>
-              <w:rPr>
-                <w:rFonts w:ascii="Verdana" w:hAnsi="Verdana" w:cs="Arial"/>
-                <w:sz w:val="22"/>
-                <w:szCs w:val="22"/>
-              </w:rPr>
               <w:t>en su calidad de</w:t>
             </w:r>
             <w:r>
@@ -1232,35 +1208,18 @@
                 <w:rFonts w:ascii="Verdana" w:hAnsi="Verdana" w:cs="Arial"/>
                 <w:sz w:val="22"/>
                 <w:szCs w:val="22"/>
-              </w:rPr>
-              <w:t xml:space="preserve">PROFESIONAL </w:t>
-            </w:r>
-            <w:proofErr w:type="gramStart"/>
-            <w:r>
-              <w:rPr>
-                <w:rFonts w:ascii="Verdana" w:hAnsi="Verdana" w:cs="Arial"/>
-                <w:sz w:val="22"/>
-                <w:szCs w:val="22"/>
-              </w:rPr>
-              <w:t>LOGÍSTICA</w:t>
-            </w:r>
-            <w:r>
-              <w:rPr>
-                <w:rFonts w:ascii="Verdana" w:hAnsi="Verdana" w:cs="Arial"/>
-                <w:sz w:val="22"/>
-                <w:szCs w:val="22"/>
-              </w:rPr>
-              <w:t xml:space="preserve"> </w:t>
-            </w:r>
-            <w:r>
-              <w:rPr>
-                <w:rFonts w:ascii="Verdana" w:hAnsi="Verdana" w:cs="Arial"/>
-                <w:sz w:val="22"/>
-                <w:szCs w:val="22"/>
-              </w:rPr>
-              <w:t xml:space="preserve"> en</w:t>
-            </w:r>
-            <w:proofErr w:type="gramEnd"/>
+                <w:u w:val="single"/>
+              </w:rPr>
+              <w:t xml:space="preserve">PROFESIONAL LOGÍSTICA </w:t>
+            </w:r>
+            <w:r>
+              <w:rPr>
+                <w:rFonts w:ascii="Verdana" w:hAnsi="Verdana" w:cs="Arial"/>
+                <w:sz w:val="22"/>
+                <w:szCs w:val="22"/>
+              </w:rPr>
+              <w:t>en</w:t>
+            </w:r>
             <w:r>
               <w:rPr>
                 <w:rFonts w:ascii="Verdana" w:hAnsi="Verdana" w:cs="Arial"/>
@@ -2592,7 +2551,18 @@
             <w:pPr>
               <w:rPr>
                 <w:rFonts w:ascii="Verdana" w:hAnsi="Verdana"/>
-                <w:bCs/>
+                <w:b/>
+                <w:color w:val="000000"/>
+                <w:sz w:val="22"/>
+                <w:szCs w:val="22"/>
+              </w:rPr>
+            </w:pPr>
+          </w:p>
+          <w:p>
+            <w:pPr>
+              <w:rPr>
+                <w:rFonts w:ascii="Verdana" w:hAnsi="Verdana"/>
+                <w:b/>
                 <w:color w:val="000000"/>
                 <w:sz w:val="22"/>
                 <w:szCs w:val="22"/>
@@ -3002,18 +2972,17 @@
                 <w:sz w:val="22"/>
                 <w:szCs w:val="22"/>
               </w:rPr>
-              <w:lastRenderedPageBreak/>
               <w:drawing>
-                <wp:anchor distT="0" distB="0" distL="114300" distR="114300" simplePos="0" relativeHeight="251670528" behindDoc="1" locked="0" layoutInCell="1" allowOverlap="1" wp14:anchorId="6CAC8BE3" wp14:editId="1F51F1E7">
+                <wp:anchor distT="0" distB="0" distL="114300" distR="114300" simplePos="0" relativeHeight="251670528" behindDoc="0" locked="0" layoutInCell="1" allowOverlap="1" wp14:anchorId="6CAC8BE3" wp14:editId="49451E01">
                   <wp:simplePos x="0" y="0"/>
                   <wp:positionH relativeFrom="column">
-                    <wp:posOffset>381635</wp:posOffset>
+                    <wp:posOffset>508635</wp:posOffset>
                   </wp:positionH>
                   <wp:positionV relativeFrom="paragraph">
-                    <wp:posOffset>97155</wp:posOffset>
+                    <wp:posOffset>38100</wp:posOffset>
                   </wp:positionV>
-                  <wp:extent cx="1822450" cy="865505"/>
-                  <wp:effectExtent l="0" t="0" r="6350" b="0"/>
+                  <wp:extent cx="1303655" cy="619125"/>
+                  <wp:effectExtent l="0" t="0" r="0" b="9525"/>
                   <wp:wrapNone/>
                   <wp:docPr id="552010827" name="Imagen 3"/>
                   <wp:cNvGraphicFramePr>
@@ -3041,7 +3010,7 @@
                         <pic:spPr>
                           <a:xfrm>
                             <a:off x="0" y="0"/>
-                            <a:ext cx="1822450" cy="865505"/>
+                            <a:ext cx="1303655" cy="619125"/>
                           </a:xfrm>
                           <a:prstGeom prst="rect">
                             <a:avLst/>
@@ -3050,10 +3019,10 @@
                       </pic:pic>
                     </a:graphicData>
                   </a:graphic>
-                  <wp14:sizeRelH relativeFrom="page">
+                  <wp14:sizeRelH relativeFrom="margin">
                     <wp14:pctWidth>0</wp14:pctWidth>
                   </wp14:sizeRelH>
-                  <wp14:sizeRelV relativeFrom="page">
+                  <wp14:sizeRelV relativeFrom="margin">
                     <wp14:pctHeight>0</wp14:pctHeight>
                   </wp14:sizeRelV>
                 </wp:anchor>
@@ -3105,7 +3074,8 @@
           <w:tbl>
             <w:tblPr>
               <w:tblStyle w:val="Tablaconcuadrcula"/>
-              <w:tblW w:w="0" w:type="auto"/>
+              <w:tblW w:w="8838" w:type="dxa"/>
+              <w:tblLayout w:type="fixed"/>
               <w:tblBorders>
                 <w:top w:val="none" w:sz="0" w:space="0" w:color="auto"/>
                 <w:left w:val="none" w:sz="0" w:space="0" w:color="auto"/>
@@ -3117,9 +3087,9 @@
               <w:tblLook w:val="04A0" w:firstRow="1" w:lastRow="0" w:firstColumn="1" w:lastColumn="0" w:noHBand="0" w:noVBand="1"/>
             </w:tblPr>
             <w:tblGrid>
-              <w:gridCol w:w="4988"/>
-              <w:gridCol w:w="284"/>
-              <w:gridCol w:w="5553"/>
+              <w:gridCol w:w="4072"/>
+              <w:gridCol w:w="232"/>
+              <w:gridCol w:w="4534"/>
             </w:tblGrid>
             <w:tr>
               <w:trPr>
@@ -3127,7 +3097,7 @@
               </w:trPr>
               <w:tc>
                 <w:tcPr>
-                  <w:tcW w:w="4988" w:type="dxa"/>
+                  <w:tcW w:w="4072" w:type="dxa"/>
                   <w:tcBorders>
                     <w:top w:val="single" w:sz="4" w:space="0" w:color="auto"/>
                   </w:tcBorders>
@@ -3170,7 +3140,7 @@
               </w:tc>
               <w:tc>
                 <w:tcPr>
-                  <w:tcW w:w="284" w:type="dxa"/>
+                  <w:tcW w:w="232" w:type="dxa"/>
                   <w:vAlign w:val="center"/>
                 </w:tcPr>
                 <w:p>
@@ -3191,7 +3161,7 @@
               </w:tc>
               <w:tc>
                 <w:tcPr>
-                  <w:tcW w:w="5553" w:type="dxa"/>
+                  <w:tcW w:w="4534" w:type="dxa"/>
                   <w:tcBorders>
                     <w:top w:val="single" w:sz="4" w:space="0" w:color="auto"/>
                   </w:tcBorders>
@@ -3251,7 +3221,7 @@
               </w:trPr>
               <w:tc>
                 <w:tcPr>
-                  <w:tcW w:w="4988" w:type="dxa"/>
+                  <w:tcW w:w="4072" w:type="dxa"/>
                 </w:tcPr>
                 <w:p>
                   <w:pPr>
@@ -3292,7 +3262,7 @@
               </w:tc>
               <w:tc>
                 <w:tcPr>
-                  <w:tcW w:w="284" w:type="dxa"/>
+                  <w:tcW w:w="232" w:type="dxa"/>
                 </w:tcPr>
                 <w:p>
                   <w:pPr>
@@ -3311,7 +3281,7 @@
               </w:tc>
               <w:tc>
                 <w:tcPr>
-                  <w:tcW w:w="5553" w:type="dxa"/>
+                  <w:tcW w:w="4534" w:type="dxa"/>
                 </w:tcPr>
                 <w:p>
                   <w:pPr>
@@ -3343,7 +3313,7 @@
               </w:trPr>
               <w:tc>
                 <w:tcPr>
-                  <w:tcW w:w="4988" w:type="dxa"/>
+                  <w:tcW w:w="4072" w:type="dxa"/>
                   <w:vAlign w:val="center"/>
                 </w:tcPr>
                 <w:p>
@@ -3379,7 +3349,7 @@
               </w:tc>
               <w:tc>
                 <w:tcPr>
-                  <w:tcW w:w="284" w:type="dxa"/>
+                  <w:tcW w:w="232" w:type="dxa"/>
                 </w:tcPr>
                 <w:p>
                   <w:pPr>
@@ -3398,7 +3368,7 @@
               </w:tc>
               <w:tc>
                 <w:tcPr>
-                  <w:tcW w:w="5553" w:type="dxa"/>
+                  <w:tcW w:w="4534" w:type="dxa"/>
                   <w:vAlign w:val="center"/>
                 </w:tcPr>
                 <w:p>
@@ -3431,7 +3401,7 @@
               </w:trPr>
               <w:tc>
                 <w:tcPr>
-                  <w:tcW w:w="4988" w:type="dxa"/>
+                  <w:tcW w:w="4072" w:type="dxa"/>
                 </w:tcPr>
                 <w:p>
                   <w:pPr>
@@ -3464,7 +3434,7 @@
               </w:tc>
               <w:tc>
                 <w:tcPr>
-                  <w:tcW w:w="284" w:type="dxa"/>
+                  <w:tcW w:w="232" w:type="dxa"/>
                 </w:tcPr>
                 <w:p>
                   <w:pPr>
@@ -3483,7 +3453,7 @@
               </w:tc>
               <w:tc>
                 <w:tcPr>
-                  <w:tcW w:w="5553" w:type="dxa"/>
+                  <w:tcW w:w="4534" w:type="dxa"/>
                 </w:tcPr>
                 <w:p>
                   <w:pPr>
@@ -3515,7 +3485,7 @@
               </w:trPr>
               <w:tc>
                 <w:tcPr>
-                  <w:tcW w:w="4988" w:type="dxa"/>
+                  <w:tcW w:w="4072" w:type="dxa"/>
                 </w:tcPr>
                 <w:p>
                   <w:pPr>
@@ -3552,7 +3522,7 @@
               </w:tc>
               <w:tc>
                 <w:tcPr>
-                  <w:tcW w:w="284" w:type="dxa"/>
+                  <w:tcW w:w="232" w:type="dxa"/>
                 </w:tcPr>
                 <w:p>
                   <w:pPr>
@@ -3571,7 +3541,7 @@
               </w:tc>
               <w:tc>
                 <w:tcPr>
-                  <w:tcW w:w="5553" w:type="dxa"/>
+                  <w:tcW w:w="4534" w:type="dxa"/>
                 </w:tcPr>
                 <w:p>
                   <w:pPr>
@@ -3601,7 +3571,7 @@
               </w:trPr>
               <w:tc>
                 <w:tcPr>
-                  <w:tcW w:w="4988" w:type="dxa"/>
+                  <w:tcW w:w="4072" w:type="dxa"/>
                 </w:tcPr>
                 <w:p>
                   <w:pPr>
@@ -3628,13 +3598,13 @@
                       <w:sz w:val="20"/>
                       <w:szCs w:val="20"/>
                     </w:rPr>
-                    <w:t>PROFESIONAL LOGÍSTICO</w:t>
+                    <w:t>Profesional Logístico</w:t>
                   </w:r>
                 </w:p>
               </w:tc>
               <w:tc>
                 <w:tcPr>
-                  <w:tcW w:w="284" w:type="dxa"/>
+                  <w:tcW w:w="232" w:type="dxa"/>
                 </w:tcPr>
                 <w:p>
                   <w:pPr>
@@ -3653,7 +3623,7 @@
               </w:tc>
               <w:tc>
                 <w:tcPr>
-                  <w:tcW w:w="5553" w:type="dxa"/>
+                  <w:tcW w:w="4534" w:type="dxa"/>
                 </w:tcPr>
                 <w:p>
                   <w:pPr>
@@ -4326,14 +4296,14 @@
     <w:tbl>
       <w:tblPr>
         <w:tblStyle w:val="Tablaconcuadrcula"/>
-        <w:tblW w:w="9622" w:type="dxa"/>
+        <w:tblW w:w="8838" w:type="dxa"/>
+        <w:tblLayout w:type="fixed"/>
         <w:tblLook w:val="04A0" w:firstRow="1" w:lastRow="0" w:firstColumn="1" w:lastColumn="0" w:noHBand="0" w:noVBand="1"/>
       </w:tblPr>
       <w:tblGrid>
-        <w:gridCol w:w="1852"/>
-        <w:gridCol w:w="1797"/>
-        <w:gridCol w:w="5952"/>
-        <w:gridCol w:w="21"/>
+        <w:gridCol w:w="1701"/>
+        <w:gridCol w:w="1651"/>
+        <w:gridCol w:w="5486"/>
       </w:tblGrid>
       <w:tr>
         <w:trPr>
@@ -4341,7 +4311,7 @@
         </w:trPr>
         <w:tc>
           <w:tcPr>
-            <w:tcW w:w="9622" w:type="dxa"/>
+            <w:tcW w:w="8838" w:type="dxa"/>
             <w:gridSpan w:val="4"/>
             <w:tcBorders>
               <w:top w:val="nil"/>
@@ -4371,7 +4341,6 @@
                 <w:szCs w:val="18"/>
                 <w:lang w:val="pt-PT"/>
               </w:rPr>
-              <w:lastRenderedPageBreak/>
               <w:t>CONTROL DE CAMBIOS</w:t>
             </w:r>
           </w:p>
@@ -4383,7 +4352,7 @@
         </w:trPr>
         <w:tc>
           <w:tcPr>
-            <w:tcW w:w="9622" w:type="dxa"/>
+            <w:tcW w:w="8838" w:type="dxa"/>
             <w:gridSpan w:val="4"/>
             <w:tcBorders>
               <w:top w:val="nil"/>
@@ -4413,7 +4382,7 @@
         </w:trPr>
         <w:tc>
           <w:tcPr>
-            <w:tcW w:w="1938" w:type="dxa"/>
+            <w:tcW w:w="1701" w:type="dxa"/>
             <w:tcBorders>
               <w:top w:val="single" w:sz="4" w:space="0" w:color="auto"/>
             </w:tcBorders>
@@ -4445,7 +4414,7 @@
         </w:tc>
         <w:tc>
           <w:tcPr>
-            <w:tcW w:w="1181" w:type="dxa"/>
+            <w:tcW w:w="1651" w:type="dxa"/>
             <w:tcBorders>
               <w:top w:val="single" w:sz="4" w:space="0" w:color="auto"/>
             </w:tcBorders>
@@ -4477,7 +4446,7 @@
         </w:tc>
         <w:tc>
           <w:tcPr>
-            <w:tcW w:w="6480" w:type="dxa"/>
+            <w:tcW w:w="5486" w:type="dxa"/>
             <w:tcBorders>
               <w:top w:val="single" w:sz="4" w:space="0" w:color="auto"/>
             </w:tcBorders>
@@ -4516,7 +4485,7 @@
         </w:trPr>
         <w:tc>
           <w:tcPr>
-            <w:tcW w:w="1938" w:type="dxa"/>
+            <w:tcW w:w="1701" w:type="dxa"/>
             <w:tcBorders>
               <w:top w:val="single" w:sz="4" w:space="0" w:color="auto"/>
             </w:tcBorders>
@@ -4544,7 +4513,7 @@
         </w:tc>
         <w:tc>
           <w:tcPr>
-            <w:tcW w:w="1181" w:type="dxa"/>
+            <w:tcW w:w="1651" w:type="dxa"/>
             <w:tcBorders>
               <w:top w:val="single" w:sz="4" w:space="0" w:color="auto"/>
             </w:tcBorders>
@@ -4590,7 +4559,7 @@
         </w:tc>
         <w:tc>
           <w:tcPr>
-            <w:tcW w:w="6480" w:type="dxa"/>
+            <w:tcW w:w="5486" w:type="dxa"/>
             <w:tcBorders>
               <w:top w:val="single" w:sz="4" w:space="0" w:color="auto"/>
             </w:tcBorders>
@@ -6646,15 +6615,16 @@
 </file>
 
 <file path=customXml/item1.xml><?xml version="1.0" encoding="utf-8"?>
-<?mso-contentType ?>
-<FormTemplates xmlns="http://schemas.microsoft.com/sharepoint/v3/contenttype/forms">
-  <Display>DocumentLibraryForm</Display>
-  <Edit>DocumentLibraryForm</Edit>
-  <New>DocumentLibraryForm</New>
-</FormTemplates>
+<p:properties xmlns:p="http://schemas.microsoft.com/office/2006/metadata/properties" xmlns:xsi="http://www.w3.org/2001/XMLSchema-instance" xmlns:pc="http://schemas.microsoft.com/office/infopath/2007/PartnerControls">
+  <documentManagement/>
+</p:properties>
 </file>
 
 <file path=customXml/item2.xml><?xml version="1.0" encoding="utf-8"?>
+<b:Sources xmlns:b="http://schemas.openxmlformats.org/officeDocument/2006/bibliography" xmlns="http://schemas.openxmlformats.org/officeDocument/2006/bibliography" SelectedStyle="\APASixthEditionOfficeOnline.xsl" StyleName="APA" Version="6"/>
+</file>
+
+<file path=customXml/item3.xml><?xml version="1.0" encoding="utf-8"?>
 <ct:contentTypeSchema xmlns:ct="http://schemas.microsoft.com/office/2006/metadata/contentType" xmlns:ma="http://schemas.microsoft.com/office/2006/metadata/properties/metaAttributes" ct:_="" ma:_="" ma:contentTypeName="Document" ma:contentTypeID="0x010100A30B331C4838804993200D47FCE41471" ma:contentTypeVersion="11" ma:contentTypeDescription="Create a new document." ma:contentTypeScope="" ma:versionID="d9801eb647fd58e56a8b175437891573">
   <xsd:schema xmlns:xsd="http://www.w3.org/2001/XMLSchema" xmlns:xs="http://www.w3.org/2001/XMLSchema" xmlns:p="http://schemas.microsoft.com/office/2006/metadata/properties" xmlns:ns3="2e532581-20e9-408c-a3d6-754b6c32e08b" xmlns:ns4="ab9f0e5a-eb09-4b64-a8eb-5db8af803633" targetNamespace="http://schemas.microsoft.com/office/2006/metadata/properties" ma:root="true" ma:fieldsID="c3d21b39ec3e984babe6119bab9014b0" ns3:_="" ns4:_="">
     <xsd:import namespace="2e532581-20e9-408c-a3d6-754b6c32e08b"/>
@@ -6863,25 +6833,33 @@
 </ct:contentTypeSchema>
 </file>
 
-<file path=customXml/item3.xml><?xml version="1.0" encoding="utf-8"?>
-<b:Sources xmlns:b="http://schemas.openxmlformats.org/officeDocument/2006/bibliography" xmlns="http://schemas.openxmlformats.org/officeDocument/2006/bibliography" SelectedStyle="\APASixthEditionOfficeOnline.xsl" StyleName="APA" Version="6"/>
-</file>
-
 <file path=customXml/item4.xml><?xml version="1.0" encoding="utf-8"?>
-<p:properties xmlns:p="http://schemas.microsoft.com/office/2006/metadata/properties" xmlns:xsi="http://www.w3.org/2001/XMLSchema-instance" xmlns:pc="http://schemas.microsoft.com/office/infopath/2007/PartnerControls">
-  <documentManagement/>
-</p:properties>
+<?mso-contentType ?>
+<FormTemplates xmlns="http://schemas.microsoft.com/sharepoint/v3/contenttype/forms">
+  <Display>DocumentLibraryForm</Display>
+  <Edit>DocumentLibraryForm</Edit>
+  <New>DocumentLibraryForm</New>
+</FormTemplates>
 </file>
 
 <file path=customXml/itemProps1.xml><?xml version="1.0" encoding="utf-8"?>
-<ds:datastoreItem xmlns:ds="http://schemas.openxmlformats.org/officeDocument/2006/customXml" ds:itemID="{0AD0403F-4538-4F35-895B-4A73F29FF4F4}">
+<ds:datastoreItem xmlns:ds="http://schemas.openxmlformats.org/officeDocument/2006/customXml" ds:itemID="{8B7F66FD-9D04-4EC5-B43D-084D53B4EF9C}">
   <ds:schemaRefs>
-    <ds:schemaRef ds:uri="http://schemas.microsoft.com/sharepoint/v3/contenttype/forms"/>
+    <ds:schemaRef ds:uri="http://schemas.microsoft.com/office/2006/metadata/properties"/>
+    <ds:schemaRef ds:uri="http://schemas.microsoft.com/office/infopath/2007/PartnerControls"/>
   </ds:schemaRefs>
 </ds:datastoreItem>
 </file>
 
 <file path=customXml/itemProps2.xml><?xml version="1.0" encoding="utf-8"?>
+<ds:datastoreItem xmlns:ds="http://schemas.openxmlformats.org/officeDocument/2006/customXml" ds:itemID="{273F679F-9FD1-4033-8859-4F0F279958DA}">
+  <ds:schemaRefs>
+    <ds:schemaRef ds:uri="http://schemas.openxmlformats.org/officeDocument/2006/bibliography"/>
+  </ds:schemaRefs>
+</ds:datastoreItem>
+</file>
+
+<file path=customXml/itemProps3.xml><?xml version="1.0" encoding="utf-8"?>
 <ds:datastoreItem xmlns:ds="http://schemas.openxmlformats.org/officeDocument/2006/customXml" ds:itemID="{36349CA1-45D6-4016-A788-A8C5D419407B}">
   <ds:schemaRefs>
     <ds:schemaRef ds:uri="http://schemas.microsoft.com/office/2006/metadata/contentType"/>
@@ -6900,19 +6878,10 @@
 </ds:datastoreItem>
 </file>
 
-<file path=customXml/itemProps3.xml><?xml version="1.0" encoding="utf-8"?>
-<ds:datastoreItem xmlns:ds="http://schemas.openxmlformats.org/officeDocument/2006/customXml" ds:itemID="{273F679F-9FD1-4033-8859-4F0F279958DA}">
+<file path=customXml/itemProps4.xml><?xml version="1.0" encoding="utf-8"?>
+<ds:datastoreItem xmlns:ds="http://schemas.openxmlformats.org/officeDocument/2006/customXml" ds:itemID="{0AD0403F-4538-4F35-895B-4A73F29FF4F4}">
   <ds:schemaRefs>
-    <ds:schemaRef ds:uri="http://schemas.openxmlformats.org/officeDocument/2006/bibliography"/>
-  </ds:schemaRefs>
-</ds:datastoreItem>
-</file>
-
-<file path=customXml/itemProps4.xml><?xml version="1.0" encoding="utf-8"?>
-<ds:datastoreItem xmlns:ds="http://schemas.openxmlformats.org/officeDocument/2006/customXml" ds:itemID="{8B7F66FD-9D04-4EC5-B43D-084D53B4EF9C}">
-  <ds:schemaRefs>
-    <ds:schemaRef ds:uri="http://schemas.microsoft.com/office/2006/metadata/properties"/>
-    <ds:schemaRef ds:uri="http://schemas.microsoft.com/office/infopath/2007/PartnerControls"/>
+    <ds:schemaRef ds:uri="http://schemas.microsoft.com/sharepoint/v3/contenttype/forms"/>
   </ds:schemaRefs>
 </ds:datastoreItem>
 </file>
</xml_diff>

<commit_message>
Respetar anchos de columna de la plantilla del usuario y agregar cache-busting en descarga de plantillas
</commit_message>
<xml_diff>
--- a/LOG-026-Acta de Verificacion y Legalizacion de para bolsa_V1.docx
+++ b/LOG-026-Acta de Verificacion y Legalizacion de para bolsa_V1.docx
@@ -4,8 +4,7 @@
   <w:body>
     <w:tbl>
       <w:tblPr>
-        <w:tblW w:w="8838" w:type="dxa"/>
-        <w:tblLayout w:type="fixed"/>
+        <w:tblW w:w="11340" w:type="dxa"/>
         <w:jc w:val="center"/>
         <w:tblBorders>
           <w:top w:val="single" w:sz="4" w:space="0" w:color="BFBFBF" w:themeColor="background1" w:themeShade="BF"/>
@@ -16,6 +15,7 @@
           <w:insideV w:val="single" w:sz="4" w:space="0" w:color="BFBFBF" w:themeColor="background1" w:themeShade="BF"/>
         </w:tblBorders>
         <w:shd w:val="clear" w:color="auto" w:fill="BFBFBF" w:themeFill="background1" w:themeFillShade="BF"/>
+        <w:tblLayout w:type="fixed"/>
         <w:tblCellMar>
           <w:left w:w="70" w:type="dxa"/>
           <w:right w:w="70" w:type="dxa"/>
@@ -23,12 +23,12 @@
         <w:tblLook w:val="0000" w:firstRow="0" w:lastRow="0" w:firstColumn="0" w:lastColumn="0" w:noHBand="0" w:noVBand="0"/>
       </w:tblPr>
       <w:tblGrid>
-        <w:gridCol w:w="2387"/>
-        <w:gridCol w:w="1544"/>
-        <w:gridCol w:w="989"/>
-        <w:gridCol w:w="866"/>
-        <w:gridCol w:w="969"/>
-        <w:gridCol w:w="2083"/>
+        <w:gridCol w:w="2808"/>
+        <w:gridCol w:w="1817"/>
+        <w:gridCol w:w="1163"/>
+        <w:gridCol w:w="1018"/>
+        <w:gridCol w:w="1141"/>
+        <w:gridCol w:w="3393"/>
       </w:tblGrid>
       <w:tr>
         <w:trPr>
@@ -73,7 +73,7 @@
         </w:trPr>
         <w:tc>
           <w:tcPr>
-            <w:tcW w:w="1350" w:type="pct"/>
+            <w:tcW w:w="1238" w:type="pct"/>
             <w:vAlign w:val="center"/>
           </w:tcPr>
           <w:p>
@@ -97,7 +97,7 @@
         </w:tc>
         <w:tc>
           <w:tcPr>
-            <w:tcW w:w="1432" w:type="pct"/>
+            <w:tcW w:w="1314" w:type="pct"/>
             <w:gridSpan w:val="2"/>
             <w:vAlign w:val="center"/>
           </w:tcPr>
@@ -115,7 +115,7 @@
         </w:tc>
         <w:tc>
           <w:tcPr>
-            <w:tcW w:w="1038" w:type="pct"/>
+            <w:tcW w:w="952" w:type="pct"/>
             <w:gridSpan w:val="2"/>
             <w:vAlign w:val="center"/>
           </w:tcPr>
@@ -141,7 +141,7 @@
         </w:tc>
         <w:tc>
           <w:tcPr>
-            <w:tcW w:w="1180" w:type="pct"/>
+            <w:tcW w:w="1496" w:type="pct"/>
             <w:vAlign w:val="center"/>
           </w:tcPr>
           <w:p>
@@ -164,7 +164,7 @@
         </w:trPr>
         <w:tc>
           <w:tcPr>
-            <w:tcW w:w="1350" w:type="pct"/>
+            <w:tcW w:w="1238" w:type="pct"/>
             <w:vAlign w:val="center"/>
           </w:tcPr>
           <w:p>
@@ -188,7 +188,7 @@
         </w:tc>
         <w:tc>
           <w:tcPr>
-            <w:tcW w:w="1432" w:type="pct"/>
+            <w:tcW w:w="1314" w:type="pct"/>
             <w:gridSpan w:val="2"/>
             <w:vAlign w:val="center"/>
           </w:tcPr>
@@ -206,7 +206,7 @@
         </w:tc>
         <w:tc>
           <w:tcPr>
-            <w:tcW w:w="1038" w:type="pct"/>
+            <w:tcW w:w="952" w:type="pct"/>
             <w:gridSpan w:val="2"/>
             <w:vAlign w:val="center"/>
           </w:tcPr>
@@ -232,7 +232,7 @@
         </w:tc>
         <w:tc>
           <w:tcPr>
-            <w:tcW w:w="1180" w:type="pct"/>
+            <w:tcW w:w="1496" w:type="pct"/>
             <w:vAlign w:val="center"/>
           </w:tcPr>
           <w:p>
@@ -255,7 +255,7 @@
         </w:trPr>
         <w:tc>
           <w:tcPr>
-            <w:tcW w:w="1350" w:type="pct"/>
+            <w:tcW w:w="1238" w:type="pct"/>
             <w:vAlign w:val="center"/>
           </w:tcPr>
           <w:p>
@@ -279,7 +279,7 @@
         </w:tc>
         <w:tc>
           <w:tcPr>
-            <w:tcW w:w="1432" w:type="pct"/>
+            <w:tcW w:w="1314" w:type="pct"/>
             <w:gridSpan w:val="2"/>
             <w:vAlign w:val="center"/>
           </w:tcPr>
@@ -296,7 +296,7 @@
         </w:tc>
         <w:tc>
           <w:tcPr>
-            <w:tcW w:w="1038" w:type="pct"/>
+            <w:tcW w:w="952" w:type="pct"/>
             <w:gridSpan w:val="2"/>
             <w:vAlign w:val="center"/>
           </w:tcPr>
@@ -329,7 +329,7 @@
         </w:tc>
         <w:tc>
           <w:tcPr>
-            <w:tcW w:w="1180" w:type="pct"/>
+            <w:tcW w:w="1496" w:type="pct"/>
             <w:vAlign w:val="center"/>
           </w:tcPr>
           <w:p>
@@ -351,7 +351,7 @@
         </w:trPr>
         <w:tc>
           <w:tcPr>
-            <w:tcW w:w="1350" w:type="pct"/>
+            <w:tcW w:w="1238" w:type="pct"/>
             <w:vAlign w:val="center"/>
           </w:tcPr>
           <w:p>
@@ -375,7 +375,7 @@
         </w:tc>
         <w:tc>
           <w:tcPr>
-            <w:tcW w:w="3650" w:type="pct"/>
+            <w:tcW w:w="3762" w:type="pct"/>
             <w:gridSpan w:val="5"/>
             <w:vAlign w:val="center"/>
           </w:tcPr>
@@ -469,7 +469,7 @@
         </w:trPr>
         <w:tc>
           <w:tcPr>
-            <w:tcW w:w="1350" w:type="pct"/>
+            <w:tcW w:w="1238" w:type="pct"/>
             <w:vAlign w:val="center"/>
           </w:tcPr>
           <w:p>
@@ -494,7 +494,7 @@
         </w:tc>
         <w:tc>
           <w:tcPr>
-            <w:tcW w:w="1432" w:type="pct"/>
+            <w:tcW w:w="1314" w:type="pct"/>
             <w:gridSpan w:val="2"/>
             <w:vAlign w:val="center"/>
           </w:tcPr>
@@ -520,7 +520,7 @@
         </w:tc>
         <w:tc>
           <w:tcPr>
-            <w:tcW w:w="1038" w:type="pct"/>
+            <w:tcW w:w="952" w:type="pct"/>
             <w:gridSpan w:val="2"/>
             <w:vAlign w:val="center"/>
           </w:tcPr>
@@ -546,7 +546,7 @@
         </w:tc>
         <w:tc>
           <w:tcPr>
-            <w:tcW w:w="1180" w:type="pct"/>
+            <w:tcW w:w="1496" w:type="pct"/>
             <w:vAlign w:val="center"/>
           </w:tcPr>
           <w:p>
@@ -577,7 +577,7 @@
         </w:trPr>
         <w:tc>
           <w:tcPr>
-            <w:tcW w:w="1350" w:type="pct"/>
+            <w:tcW w:w="1238" w:type="pct"/>
             <w:vAlign w:val="center"/>
           </w:tcPr>
           <w:p>
@@ -593,7 +593,7 @@
         </w:tc>
         <w:tc>
           <w:tcPr>
-            <w:tcW w:w="1432" w:type="pct"/>
+            <w:tcW w:w="1314" w:type="pct"/>
             <w:gridSpan w:val="2"/>
             <w:vAlign w:val="center"/>
           </w:tcPr>
@@ -610,7 +610,7 @@
         </w:tc>
         <w:tc>
           <w:tcPr>
-            <w:tcW w:w="1038" w:type="pct"/>
+            <w:tcW w:w="952" w:type="pct"/>
             <w:gridSpan w:val="2"/>
             <w:vAlign w:val="center"/>
           </w:tcPr>
@@ -627,7 +627,7 @@
         </w:tc>
         <w:tc>
           <w:tcPr>
-            <w:tcW w:w="1180" w:type="pct"/>
+            <w:tcW w:w="1496" w:type="pct"/>
             <w:vAlign w:val="center"/>
           </w:tcPr>
           <w:p>
@@ -649,7 +649,7 @@
         </w:trPr>
         <w:tc>
           <w:tcPr>
-            <w:tcW w:w="1350" w:type="pct"/>
+            <w:tcW w:w="1238" w:type="pct"/>
             <w:vAlign w:val="center"/>
           </w:tcPr>
           <w:p>
@@ -665,7 +665,7 @@
         </w:tc>
         <w:tc>
           <w:tcPr>
-            <w:tcW w:w="1432" w:type="pct"/>
+            <w:tcW w:w="1314" w:type="pct"/>
             <w:gridSpan w:val="2"/>
             <w:vAlign w:val="center"/>
           </w:tcPr>
@@ -682,7 +682,7 @@
         </w:tc>
         <w:tc>
           <w:tcPr>
-            <w:tcW w:w="1038" w:type="pct"/>
+            <w:tcW w:w="952" w:type="pct"/>
             <w:gridSpan w:val="2"/>
             <w:vAlign w:val="center"/>
           </w:tcPr>
@@ -699,7 +699,7 @@
         </w:tc>
         <w:tc>
           <w:tcPr>
-            <w:tcW w:w="1180" w:type="pct"/>
+            <w:tcW w:w="1496" w:type="pct"/>
             <w:vAlign w:val="center"/>
           </w:tcPr>
           <w:p>
@@ -721,7 +721,7 @@
         </w:trPr>
         <w:tc>
           <w:tcPr>
-            <w:tcW w:w="1350" w:type="pct"/>
+            <w:tcW w:w="1238" w:type="pct"/>
             <w:vAlign w:val="center"/>
           </w:tcPr>
           <w:p>
@@ -737,7 +737,7 @@
         </w:tc>
         <w:tc>
           <w:tcPr>
-            <w:tcW w:w="1432" w:type="pct"/>
+            <w:tcW w:w="1314" w:type="pct"/>
             <w:gridSpan w:val="2"/>
             <w:vAlign w:val="center"/>
           </w:tcPr>
@@ -754,7 +754,7 @@
         </w:tc>
         <w:tc>
           <w:tcPr>
-            <w:tcW w:w="1038" w:type="pct"/>
+            <w:tcW w:w="952" w:type="pct"/>
             <w:gridSpan w:val="2"/>
             <w:vAlign w:val="center"/>
           </w:tcPr>
@@ -771,7 +771,7 @@
         </w:tc>
         <w:tc>
           <w:tcPr>
-            <w:tcW w:w="1180" w:type="pct"/>
+            <w:tcW w:w="1496" w:type="pct"/>
             <w:vAlign w:val="center"/>
           </w:tcPr>
           <w:p>
@@ -793,7 +793,7 @@
         </w:trPr>
         <w:tc>
           <w:tcPr>
-            <w:tcW w:w="1350" w:type="pct"/>
+            <w:tcW w:w="1238" w:type="pct"/>
             <w:vAlign w:val="center"/>
           </w:tcPr>
           <w:p>
@@ -809,7 +809,7 @@
         </w:tc>
         <w:tc>
           <w:tcPr>
-            <w:tcW w:w="1432" w:type="pct"/>
+            <w:tcW w:w="1314" w:type="pct"/>
             <w:gridSpan w:val="2"/>
             <w:vAlign w:val="center"/>
           </w:tcPr>
@@ -826,7 +826,7 @@
         </w:tc>
         <w:tc>
           <w:tcPr>
-            <w:tcW w:w="1038" w:type="pct"/>
+            <w:tcW w:w="952" w:type="pct"/>
             <w:gridSpan w:val="2"/>
             <w:vAlign w:val="center"/>
           </w:tcPr>
@@ -843,7 +843,7 @@
         </w:tc>
         <w:tc>
           <w:tcPr>
-            <w:tcW w:w="1180" w:type="pct"/>
+            <w:tcW w:w="1496" w:type="pct"/>
             <w:vAlign w:val="center"/>
           </w:tcPr>
           <w:p>
@@ -865,7 +865,7 @@
         </w:trPr>
         <w:tc>
           <w:tcPr>
-            <w:tcW w:w="1350" w:type="pct"/>
+            <w:tcW w:w="1238" w:type="pct"/>
             <w:vAlign w:val="center"/>
           </w:tcPr>
           <w:p>
@@ -881,7 +881,7 @@
         </w:tc>
         <w:tc>
           <w:tcPr>
-            <w:tcW w:w="1432" w:type="pct"/>
+            <w:tcW w:w="1314" w:type="pct"/>
             <w:gridSpan w:val="2"/>
             <w:vAlign w:val="center"/>
           </w:tcPr>
@@ -898,7 +898,7 @@
         </w:tc>
         <w:tc>
           <w:tcPr>
-            <w:tcW w:w="1038" w:type="pct"/>
+            <w:tcW w:w="952" w:type="pct"/>
             <w:gridSpan w:val="2"/>
             <w:vAlign w:val="center"/>
           </w:tcPr>
@@ -915,7 +915,7 @@
         </w:tc>
         <w:tc>
           <w:tcPr>
-            <w:tcW w:w="1180" w:type="pct"/>
+            <w:tcW w:w="1496" w:type="pct"/>
             <w:vAlign w:val="center"/>
           </w:tcPr>
           <w:p>
@@ -970,7 +970,7 @@
         </w:trPr>
         <w:tc>
           <w:tcPr>
-            <w:tcW w:w="1350" w:type="pct"/>
+            <w:tcW w:w="1238" w:type="pct"/>
             <w:vAlign w:val="center"/>
           </w:tcPr>
           <w:p>
@@ -994,7 +994,7 @@
         </w:tc>
         <w:tc>
           <w:tcPr>
-            <w:tcW w:w="1922" w:type="pct"/>
+            <w:tcW w:w="1763" w:type="pct"/>
             <w:gridSpan w:val="3"/>
             <w:vAlign w:val="center"/>
           </w:tcPr>
@@ -1020,7 +1020,7 @@
         </w:tc>
         <w:tc>
           <w:tcPr>
-            <w:tcW w:w="548" w:type="pct"/>
+            <w:tcW w:w="503" w:type="pct"/>
             <w:vAlign w:val="center"/>
           </w:tcPr>
           <w:p>
@@ -1045,7 +1045,7 @@
         </w:tc>
         <w:tc>
           <w:tcPr>
-            <w:tcW w:w="1180" w:type="pct"/>
+            <w:tcW w:w="1496" w:type="pct"/>
             <w:vAlign w:val="center"/>
           </w:tcPr>
           <w:p>
@@ -1501,6 +1501,7 @@
                 <w:szCs w:val="20"/>
                 <w:lang w:val="es-CO"/>
               </w:rPr>
+              <w:lastRenderedPageBreak/>
               <w:t>En consecuencia, será responsabilidad de la Institución Educativa y/o sede contratar y mantener vigentes las pólizas de seguro y/o garantías que considere necesarias para amparar los bienes entregados frente a eventos tales como pérdida, hurto, daño, destrucción o afectaciones derivadas de desastres naturales, entre otros riesgos que puedan comprometer su integridad o funcionamiento.</w:t>
             </w:r>
           </w:p>
@@ -1520,7 +1521,6 @@
                 <w:sz w:val="20"/>
                 <w:szCs w:val="20"/>
               </w:rPr>
-              <w:lastRenderedPageBreak/>
               <w:t>Se deja expresamente establecido que los eventos anteriormente señalados no se encuentran cubiertos por la garantía otorgada por la Asociación Computadores para Educar.</w:t>
             </w:r>
           </w:p>
@@ -2153,7 +2153,16 @@
                 <w:sz w:val="20"/>
                 <w:szCs w:val="20"/>
               </w:rPr>
-              <w:t xml:space="preserve">e tener en cuenta las siguientes excepciones para que la garantía se pueda aplicar: cuando el periodo de garantía haya expirado; sea cualquiera el tiempo transcurrido después de la fecha de terminación de la garantía; mal manejo o manipulación de las terminales efectuada por parte del usuario o de terceros no autorizados, así como modificaciones o ampliaciones posteriores no incluidas en la configuración original; daños del sistema operativo ocasionados por instalación de software adicional o por utilización incorrecta del mismo; daños ocasionados por virus informáticos o pérdidas de información; todo tipo de problemas ocasionados por  instalación de periféricos o software adquiridos a terceros, que presenten incompatibilidades; daños causados por desastres naturales (rayos, terremotos) </w:t>
+              <w:t xml:space="preserve">e tener en cuenta las siguientes excepciones para que la garantía se pueda aplicar: cuando el periodo de garantía haya expirado; sea cualquiera el tiempo transcurrido después de la fecha de terminación de la garantía; mal manejo o manipulación de las terminales efectuada por parte del usuario o de terceros no autorizados, así </w:t>
+            </w:r>
+            <w:r>
+              <w:rPr>
+                <w:rFonts w:ascii="Verdana" w:eastAsia="Yu Gothic UI Semilight" w:hAnsi="Verdana" w:cs="Arial"/>
+                <w:sz w:val="20"/>
+                <w:szCs w:val="20"/>
+              </w:rPr>
+              <w:lastRenderedPageBreak/>
+              <w:t xml:space="preserve">como modificaciones o ampliaciones posteriores no incluidas en la configuración original; daños del sistema operativo ocasionados por instalación de software adicional o por utilización incorrecta del mismo; daños ocasionados por virus informáticos o pérdidas de información; todo tipo de problemas ocasionados por  instalación de periféricos o software adquiridos a terceros, que presenten incompatibilidades; daños causados por desastres naturales (rayos, terremotos) </w:t>
             </w:r>
             <w:proofErr w:type="spellStart"/>
             <w:r>
@@ -2171,16 +2180,7 @@
                 <w:sz w:val="20"/>
                 <w:szCs w:val="20"/>
               </w:rPr>
-              <w:t xml:space="preserve"> accidentes diversos como incendios, inundaciones, entre otros; daños como oxidación o sulfatación de partes internas de las terminales ocasionados por condiciones climáticas inadecuadas en el aula que no </w:t>
-            </w:r>
-            <w:r>
-              <w:rPr>
-                <w:rFonts w:ascii="Verdana" w:eastAsia="Yu Gothic UI Semilight" w:hAnsi="Verdana" w:cs="Arial"/>
-                <w:sz w:val="20"/>
-                <w:szCs w:val="20"/>
-              </w:rPr>
-              <w:lastRenderedPageBreak/>
-              <w:t>garanticen la preservación y cuidado de los mismos; daños ocasionados por causas externas como accidentes (golpes), derrame de bebidas o alimentos sobre las terminales, problemas con el suministro de energía (sobrevoltajes), maltrato y situaciones similares; daños ocasionados por el mal embalaje de las terminales  al momento de remitirlos por Garantía a Computadores para Educar. La superficie o plataforma de impresión de la impresora 3D no tiene garantía.</w:t>
+              <w:t xml:space="preserve"> accidentes diversos como incendios, inundaciones, entre otros; daños como oxidación o sulfatación de partes internas de las terminales ocasionados por condiciones climáticas inadecuadas en el aula que no garanticen la preservación y cuidado de los mismos; daños ocasionados por causas externas como accidentes (golpes), derrame de bebidas o alimentos sobre las terminales, problemas con el suministro de energía (sobrevoltajes), maltrato y situaciones similares; daños ocasionados por el mal embalaje de las terminales  al momento de remitirlos por Garantía a Computadores para Educar. La superficie o plataforma de impresión de la impresora 3D no tiene garantía.</w:t>
             </w:r>
           </w:p>
           <w:p>
@@ -2682,6 +2682,7 @@
                 <w:sz w:val="18"/>
                 <w:szCs w:val="18"/>
               </w:rPr>
+              <w:lastRenderedPageBreak/>
               <w:t>El Representante legal o autoridad de la comunidad que recibe esta dotación, declara que la recibe a entera satisfacción y se compromete a seguir cumpliendo con las obligaciones relacionadas anteriormente.</w:t>
             </w:r>
           </w:p>
@@ -3075,7 +3076,6 @@
             <w:tblPr>
               <w:tblStyle w:val="Tablaconcuadrcula"/>
               <w:tblW w:w="8838" w:type="dxa"/>
-              <w:tblLayout w:type="fixed"/>
               <w:tblBorders>
                 <w:top w:val="none" w:sz="0" w:space="0" w:color="auto"/>
                 <w:left w:val="none" w:sz="0" w:space="0" w:color="auto"/>
@@ -3084,12 +3084,13 @@
                 <w:insideH w:val="none" w:sz="0" w:space="0" w:color="auto"/>
                 <w:insideV w:val="none" w:sz="0" w:space="0" w:color="auto"/>
               </w:tblBorders>
+              <w:tblLayout w:type="fixed"/>
               <w:tblLook w:val="04A0" w:firstRow="1" w:lastRow="0" w:firstColumn="1" w:lastColumn="0" w:noHBand="0" w:noVBand="1"/>
             </w:tblPr>
             <w:tblGrid>
-              <w:gridCol w:w="4072"/>
-              <w:gridCol w:w="232"/>
-              <w:gridCol w:w="4534"/>
+              <w:gridCol w:w="4070"/>
+              <w:gridCol w:w="236"/>
+              <w:gridCol w:w="4532"/>
             </w:tblGrid>
             <w:tr>
               <w:trPr>
@@ -3788,7 +3789,6 @@
                 <w:sz w:val="20"/>
                 <w:szCs w:val="20"/>
               </w:rPr>
-              <w:lastRenderedPageBreak/>
               <w:t>REGISTRO FOTOGRÁFICO (Mínimo dos fotografías)</w:t>
             </w:r>
           </w:p>
@@ -3804,7 +3804,7 @@
         </w:trPr>
         <w:tc>
           <w:tcPr>
-            <w:tcW w:w="2223" w:type="pct"/>
+            <w:tcW w:w="2039" w:type="pct"/>
             <w:gridSpan w:val="2"/>
             <w:tcBorders>
               <w:top w:val="single" w:sz="4" w:space="0" w:color="BFBFBF" w:themeColor="background1" w:themeShade="BF"/>
@@ -3830,6 +3830,7 @@
                 <w:sz w:val="22"/>
                 <w:szCs w:val="22"/>
               </w:rPr>
+              <w:lastRenderedPageBreak/>
               <mc:AlternateContent>
                 <mc:Choice Requires="wps">
                   <w:drawing>
@@ -4029,7 +4030,7 @@
         </w:tc>
         <w:tc>
           <w:tcPr>
-            <w:tcW w:w="2777" w:type="pct"/>
+            <w:tcW w:w="2961" w:type="pct"/>
             <w:gridSpan w:val="4"/>
             <w:tcBorders>
               <w:top w:val="single" w:sz="4" w:space="0" w:color="BFBFBF" w:themeColor="background1" w:themeShade="BF"/>
@@ -4301,9 +4302,10 @@
         <w:tblLook w:val="04A0" w:firstRow="1" w:lastRow="0" w:firstColumn="1" w:lastColumn="0" w:noHBand="0" w:noVBand="1"/>
       </w:tblPr>
       <w:tblGrid>
-        <w:gridCol w:w="1701"/>
-        <w:gridCol w:w="1651"/>
-        <w:gridCol w:w="5486"/>
+        <w:gridCol w:w="1697"/>
+        <w:gridCol w:w="1647"/>
+        <w:gridCol w:w="5471"/>
+        <w:gridCol w:w="23"/>
       </w:tblGrid>
       <w:tr>
         <w:trPr>
@@ -6615,16 +6617,15 @@
 </file>
 
 <file path=customXml/item1.xml><?xml version="1.0" encoding="utf-8"?>
-<p:properties xmlns:p="http://schemas.microsoft.com/office/2006/metadata/properties" xmlns:xsi="http://www.w3.org/2001/XMLSchema-instance" xmlns:pc="http://schemas.microsoft.com/office/infopath/2007/PartnerControls">
-  <documentManagement/>
-</p:properties>
+<?mso-contentType ?>
+<FormTemplates xmlns="http://schemas.microsoft.com/sharepoint/v3/contenttype/forms">
+  <Display>DocumentLibraryForm</Display>
+  <Edit>DocumentLibraryForm</Edit>
+  <New>DocumentLibraryForm</New>
+</FormTemplates>
 </file>
 
 <file path=customXml/item2.xml><?xml version="1.0" encoding="utf-8"?>
-<b:Sources xmlns:b="http://schemas.openxmlformats.org/officeDocument/2006/bibliography" xmlns="http://schemas.openxmlformats.org/officeDocument/2006/bibliography" SelectedStyle="\APASixthEditionOfficeOnline.xsl" StyleName="APA" Version="6"/>
-</file>
-
-<file path=customXml/item3.xml><?xml version="1.0" encoding="utf-8"?>
 <ct:contentTypeSchema xmlns:ct="http://schemas.microsoft.com/office/2006/metadata/contentType" xmlns:ma="http://schemas.microsoft.com/office/2006/metadata/properties/metaAttributes" ct:_="" ma:_="" ma:contentTypeName="Document" ma:contentTypeID="0x010100A30B331C4838804993200D47FCE41471" ma:contentTypeVersion="11" ma:contentTypeDescription="Create a new document." ma:contentTypeScope="" ma:versionID="d9801eb647fd58e56a8b175437891573">
   <xsd:schema xmlns:xsd="http://www.w3.org/2001/XMLSchema" xmlns:xs="http://www.w3.org/2001/XMLSchema" xmlns:p="http://schemas.microsoft.com/office/2006/metadata/properties" xmlns:ns3="2e532581-20e9-408c-a3d6-754b6c32e08b" xmlns:ns4="ab9f0e5a-eb09-4b64-a8eb-5db8af803633" targetNamespace="http://schemas.microsoft.com/office/2006/metadata/properties" ma:root="true" ma:fieldsID="c3d21b39ec3e984babe6119bab9014b0" ns3:_="" ns4:_="">
     <xsd:import namespace="2e532581-20e9-408c-a3d6-754b6c32e08b"/>
@@ -6833,33 +6834,25 @@
 </ct:contentTypeSchema>
 </file>
 
+<file path=customXml/item3.xml><?xml version="1.0" encoding="utf-8"?>
+<b:Sources xmlns:b="http://schemas.openxmlformats.org/officeDocument/2006/bibliography" xmlns="http://schemas.openxmlformats.org/officeDocument/2006/bibliography" SelectedStyle="\APASixthEditionOfficeOnline.xsl" StyleName="APA" Version="6"/>
+</file>
+
 <file path=customXml/item4.xml><?xml version="1.0" encoding="utf-8"?>
-<?mso-contentType ?>
-<FormTemplates xmlns="http://schemas.microsoft.com/sharepoint/v3/contenttype/forms">
-  <Display>DocumentLibraryForm</Display>
-  <Edit>DocumentLibraryForm</Edit>
-  <New>DocumentLibraryForm</New>
-</FormTemplates>
+<p:properties xmlns:p="http://schemas.microsoft.com/office/2006/metadata/properties" xmlns:xsi="http://www.w3.org/2001/XMLSchema-instance" xmlns:pc="http://schemas.microsoft.com/office/infopath/2007/PartnerControls">
+  <documentManagement/>
+</p:properties>
 </file>
 
 <file path=customXml/itemProps1.xml><?xml version="1.0" encoding="utf-8"?>
-<ds:datastoreItem xmlns:ds="http://schemas.openxmlformats.org/officeDocument/2006/customXml" ds:itemID="{8B7F66FD-9D04-4EC5-B43D-084D53B4EF9C}">
+<ds:datastoreItem xmlns:ds="http://schemas.openxmlformats.org/officeDocument/2006/customXml" ds:itemID="{0AD0403F-4538-4F35-895B-4A73F29FF4F4}">
   <ds:schemaRefs>
-    <ds:schemaRef ds:uri="http://schemas.microsoft.com/office/2006/metadata/properties"/>
-    <ds:schemaRef ds:uri="http://schemas.microsoft.com/office/infopath/2007/PartnerControls"/>
+    <ds:schemaRef ds:uri="http://schemas.microsoft.com/sharepoint/v3/contenttype/forms"/>
   </ds:schemaRefs>
 </ds:datastoreItem>
 </file>
 
 <file path=customXml/itemProps2.xml><?xml version="1.0" encoding="utf-8"?>
-<ds:datastoreItem xmlns:ds="http://schemas.openxmlformats.org/officeDocument/2006/customXml" ds:itemID="{273F679F-9FD1-4033-8859-4F0F279958DA}">
-  <ds:schemaRefs>
-    <ds:schemaRef ds:uri="http://schemas.openxmlformats.org/officeDocument/2006/bibliography"/>
-  </ds:schemaRefs>
-</ds:datastoreItem>
-</file>
-
-<file path=customXml/itemProps3.xml><?xml version="1.0" encoding="utf-8"?>
 <ds:datastoreItem xmlns:ds="http://schemas.openxmlformats.org/officeDocument/2006/customXml" ds:itemID="{36349CA1-45D6-4016-A788-A8C5D419407B}">
   <ds:schemaRefs>
     <ds:schemaRef ds:uri="http://schemas.microsoft.com/office/2006/metadata/contentType"/>
@@ -6878,10 +6871,19 @@
 </ds:datastoreItem>
 </file>
 
+<file path=customXml/itemProps3.xml><?xml version="1.0" encoding="utf-8"?>
+<ds:datastoreItem xmlns:ds="http://schemas.openxmlformats.org/officeDocument/2006/customXml" ds:itemID="{273F679F-9FD1-4033-8859-4F0F279958DA}">
+  <ds:schemaRefs>
+    <ds:schemaRef ds:uri="http://schemas.openxmlformats.org/officeDocument/2006/bibliography"/>
+  </ds:schemaRefs>
+</ds:datastoreItem>
+</file>
+
 <file path=customXml/itemProps4.xml><?xml version="1.0" encoding="utf-8"?>
-<ds:datastoreItem xmlns:ds="http://schemas.openxmlformats.org/officeDocument/2006/customXml" ds:itemID="{0AD0403F-4538-4F35-895B-4A73F29FF4F4}">
+<ds:datastoreItem xmlns:ds="http://schemas.openxmlformats.org/officeDocument/2006/customXml" ds:itemID="{8B7F66FD-9D04-4EC5-B43D-084D53B4EF9C}">
   <ds:schemaRefs>
-    <ds:schemaRef ds:uri="http://schemas.microsoft.com/sharepoint/v3/contenttype/forms"/>
+    <ds:schemaRef ds:uri="http://schemas.microsoft.com/office/2006/metadata/properties"/>
+    <ds:schemaRef ds:uri="http://schemas.microsoft.com/office/infopath/2007/PartnerControls"/>
   </ds:schemaRefs>
 </ds:datastoreItem>
 </file>
</xml_diff>

<commit_message>
Ajustar ancho de tabla a exactamente 19 cm en plantilla LOG-026-F y calibrar margenes de pagina
</commit_message>
<xml_diff>
--- a/LOG-026-Acta de Verificacion y Legalizacion de para bolsa_V1.docx
+++ b/LOG-026-Acta de Verificacion y Legalizacion de para bolsa_V1.docx
@@ -4,7 +4,7 @@
   <w:body>
     <w:tbl>
       <w:tblPr>
-        <w:tblW w:w="11340" w:type="dxa"/>
+        <w:tblW w:w="10772" w:type="dxa"/>
         <w:jc w:val="center"/>
         <w:tblBorders>
           <w:top w:val="single" w:sz="4" w:space="0" w:color="BFBFBF" w:themeColor="background1" w:themeShade="BF"/>
@@ -23,12 +23,12 @@
         <w:tblLook w:val="0000" w:firstRow="0" w:lastRow="0" w:firstColumn="0" w:lastColumn="0" w:noHBand="0" w:noVBand="0"/>
       </w:tblPr>
       <w:tblGrid>
-        <w:gridCol w:w="2808"/>
-        <w:gridCol w:w="1817"/>
-        <w:gridCol w:w="1163"/>
-        <w:gridCol w:w="1018"/>
-        <w:gridCol w:w="1141"/>
-        <w:gridCol w:w="3393"/>
+        <w:gridCol w:w="2667"/>
+        <w:gridCol w:w="1726"/>
+        <w:gridCol w:w="1105"/>
+        <w:gridCol w:w="967"/>
+        <w:gridCol w:w="1084"/>
+        <w:gridCol w:w="3223"/>
       </w:tblGrid>
       <w:tr>
         <w:trPr>
@@ -37,7 +37,7 @@
         </w:trPr>
         <w:tc>
           <w:tcPr>
-            <w:tcW w:w="5000" w:type="pct"/>
+            <w:tcW w:w="10772" w:type="dxa"/>
             <w:gridSpan w:val="6"/>
             <w:shd w:val="clear" w:color="auto" w:fill="D0CECE" w:themeFill="background2" w:themeFillShade="E6"/>
             <w:vAlign w:val="center"/>
@@ -432,7 +432,7 @@
         </w:trPr>
         <w:tc>
           <w:tcPr>
-            <w:tcW w:w="5000" w:type="pct"/>
+            <w:tcW w:w="10772" w:type="dxa"/>
             <w:gridSpan w:val="6"/>
             <w:shd w:val="clear" w:color="auto" w:fill="D0CECE" w:themeFill="background2" w:themeFillShade="E6"/>
             <w:vAlign w:val="center"/>
@@ -937,7 +937,7 @@
         </w:trPr>
         <w:tc>
           <w:tcPr>
-            <w:tcW w:w="5000" w:type="pct"/>
+            <w:tcW w:w="10772" w:type="dxa"/>
             <w:gridSpan w:val="6"/>
             <w:shd w:val="clear" w:color="auto" w:fill="D9D9D9" w:themeFill="background1" w:themeFillShade="D9"/>
             <w:vAlign w:val="center"/>
@@ -1076,7 +1076,7 @@
         </w:trPr>
         <w:tc>
           <w:tcPr>
-            <w:tcW w:w="5000" w:type="pct"/>
+            <w:tcW w:w="10772" w:type="dxa"/>
             <w:gridSpan w:val="6"/>
             <w:shd w:val="clear" w:color="auto" w:fill="D0CECE" w:themeFill="background2" w:themeFillShade="E6"/>
             <w:vAlign w:val="center"/>
@@ -1110,7 +1110,7 @@
         </w:trPr>
         <w:tc>
           <w:tcPr>
-            <w:tcW w:w="5000" w:type="pct"/>
+            <w:tcW w:w="10772" w:type="dxa"/>
             <w:gridSpan w:val="6"/>
             <w:tcBorders>
               <w:top w:val="single" w:sz="4" w:space="0" w:color="BFBFBF" w:themeColor="background1" w:themeShade="BF"/>
@@ -1294,7 +1294,7 @@
         </w:trPr>
         <w:tc>
           <w:tcPr>
-            <w:tcW w:w="5000" w:type="pct"/>
+            <w:tcW w:w="10772" w:type="dxa"/>
             <w:gridSpan w:val="6"/>
             <w:shd w:val="clear" w:color="auto" w:fill="D0CECE" w:themeFill="background2" w:themeFillShade="E6"/>
             <w:vAlign w:val="center"/>
@@ -1328,7 +1328,7 @@
         </w:trPr>
         <w:tc>
           <w:tcPr>
-            <w:tcW w:w="5000" w:type="pct"/>
+            <w:tcW w:w="10772" w:type="dxa"/>
             <w:gridSpan w:val="6"/>
             <w:tcBorders>
               <w:top w:val="single" w:sz="4" w:space="0" w:color="BFBFBF" w:themeColor="background1" w:themeShade="BF"/>
@@ -2503,7 +2503,7 @@
         </w:trPr>
         <w:tc>
           <w:tcPr>
-            <w:tcW w:w="5000" w:type="pct"/>
+            <w:tcW w:w="10772" w:type="dxa"/>
             <w:gridSpan w:val="6"/>
             <w:shd w:val="clear" w:color="auto" w:fill="D0CECE" w:themeFill="background2" w:themeFillShade="E6"/>
             <w:vAlign w:val="center"/>
@@ -2537,7 +2537,7 @@
         </w:trPr>
         <w:tc>
           <w:tcPr>
-            <w:tcW w:w="5000" w:type="pct"/>
+            <w:tcW w:w="10772" w:type="dxa"/>
             <w:gridSpan w:val="6"/>
             <w:tcBorders>
               <w:top w:val="single" w:sz="4" w:space="0" w:color="BFBFBF" w:themeColor="background1" w:themeShade="BF"/>
@@ -2655,7 +2655,7 @@
         </w:trPr>
         <w:tc>
           <w:tcPr>
-            <w:tcW w:w="5000" w:type="pct"/>
+            <w:tcW w:w="10772" w:type="dxa"/>
             <w:gridSpan w:val="6"/>
             <w:tcBorders>
               <w:top w:val="single" w:sz="4" w:space="0" w:color="BFBFBF" w:themeColor="background1" w:themeShade="BF"/>
@@ -2850,7 +2850,7 @@
         </w:trPr>
         <w:tc>
           <w:tcPr>
-            <w:tcW w:w="5000" w:type="pct"/>
+            <w:tcW w:w="10772" w:type="dxa"/>
             <w:gridSpan w:val="6"/>
             <w:tcBorders>
               <w:top w:val="single" w:sz="8" w:space="0" w:color="BFBFBF" w:themeColor="background1" w:themeShade="BF"/>
@@ -2913,7 +2913,7 @@
         </w:trPr>
         <w:tc>
           <w:tcPr>
-            <w:tcW w:w="5000" w:type="pct"/>
+            <w:tcW w:w="10772" w:type="dxa"/>
             <w:gridSpan w:val="6"/>
             <w:tcBorders>
               <w:top w:val="single" w:sz="8" w:space="0" w:color="BFBFBF" w:themeColor="background1" w:themeShade="BF"/>
@@ -3098,7 +3098,7 @@
               </w:trPr>
               <w:tc>
                 <w:tcPr>
-                  <w:tcW w:w="4072" w:type="dxa"/>
+                  <w:tcW w:w="4964" w:type="dxa"/>
                   <w:tcBorders>
                     <w:top w:val="single" w:sz="4" w:space="0" w:color="auto"/>
                   </w:tcBorders>
@@ -3141,7 +3141,7 @@
               </w:tc>
               <w:tc>
                 <w:tcPr>
-                  <w:tcW w:w="232" w:type="dxa"/>
+                  <w:tcW w:w="283" w:type="dxa"/>
                   <w:vAlign w:val="center"/>
                 </w:tcPr>
                 <w:p>
@@ -3162,7 +3162,7 @@
               </w:tc>
               <w:tc>
                 <w:tcPr>
-                  <w:tcW w:w="4534" w:type="dxa"/>
+                  <w:tcW w:w="5525" w:type="dxa"/>
                   <w:tcBorders>
                     <w:top w:val="single" w:sz="4" w:space="0" w:color="auto"/>
                   </w:tcBorders>
@@ -3222,7 +3222,7 @@
               </w:trPr>
               <w:tc>
                 <w:tcPr>
-                  <w:tcW w:w="4072" w:type="dxa"/>
+                  <w:tcW w:w="4964" w:type="dxa"/>
                 </w:tcPr>
                 <w:p>
                   <w:pPr>
@@ -3263,7 +3263,7 @@
               </w:tc>
               <w:tc>
                 <w:tcPr>
-                  <w:tcW w:w="232" w:type="dxa"/>
+                  <w:tcW w:w="283" w:type="dxa"/>
                 </w:tcPr>
                 <w:p>
                   <w:pPr>
@@ -3282,7 +3282,7 @@
               </w:tc>
               <w:tc>
                 <w:tcPr>
-                  <w:tcW w:w="4534" w:type="dxa"/>
+                  <w:tcW w:w="5525" w:type="dxa"/>
                 </w:tcPr>
                 <w:p>
                   <w:pPr>
@@ -3314,7 +3314,7 @@
               </w:trPr>
               <w:tc>
                 <w:tcPr>
-                  <w:tcW w:w="4072" w:type="dxa"/>
+                  <w:tcW w:w="4964" w:type="dxa"/>
                   <w:vAlign w:val="center"/>
                 </w:tcPr>
                 <w:p>
@@ -3350,7 +3350,7 @@
               </w:tc>
               <w:tc>
                 <w:tcPr>
-                  <w:tcW w:w="232" w:type="dxa"/>
+                  <w:tcW w:w="283" w:type="dxa"/>
                 </w:tcPr>
                 <w:p>
                   <w:pPr>
@@ -3369,7 +3369,7 @@
               </w:tc>
               <w:tc>
                 <w:tcPr>
-                  <w:tcW w:w="4534" w:type="dxa"/>
+                  <w:tcW w:w="5525" w:type="dxa"/>
                   <w:vAlign w:val="center"/>
                 </w:tcPr>
                 <w:p>
@@ -3402,7 +3402,7 @@
               </w:trPr>
               <w:tc>
                 <w:tcPr>
-                  <w:tcW w:w="4072" w:type="dxa"/>
+                  <w:tcW w:w="4964" w:type="dxa"/>
                 </w:tcPr>
                 <w:p>
                   <w:pPr>
@@ -3435,7 +3435,7 @@
               </w:tc>
               <w:tc>
                 <w:tcPr>
-                  <w:tcW w:w="232" w:type="dxa"/>
+                  <w:tcW w:w="283" w:type="dxa"/>
                 </w:tcPr>
                 <w:p>
                   <w:pPr>
@@ -3454,7 +3454,7 @@
               </w:tc>
               <w:tc>
                 <w:tcPr>
-                  <w:tcW w:w="4534" w:type="dxa"/>
+                  <w:tcW w:w="5525" w:type="dxa"/>
                 </w:tcPr>
                 <w:p>
                   <w:pPr>
@@ -3486,7 +3486,7 @@
               </w:trPr>
               <w:tc>
                 <w:tcPr>
-                  <w:tcW w:w="4072" w:type="dxa"/>
+                  <w:tcW w:w="4964" w:type="dxa"/>
                 </w:tcPr>
                 <w:p>
                   <w:pPr>
@@ -3523,7 +3523,7 @@
               </w:tc>
               <w:tc>
                 <w:tcPr>
-                  <w:tcW w:w="232" w:type="dxa"/>
+                  <w:tcW w:w="283" w:type="dxa"/>
                 </w:tcPr>
                 <w:p>
                   <w:pPr>
@@ -3542,7 +3542,7 @@
               </w:tc>
               <w:tc>
                 <w:tcPr>
-                  <w:tcW w:w="4534" w:type="dxa"/>
+                  <w:tcW w:w="5525" w:type="dxa"/>
                 </w:tcPr>
                 <w:p>
                   <w:pPr>
@@ -3572,7 +3572,7 @@
               </w:trPr>
               <w:tc>
                 <w:tcPr>
-                  <w:tcW w:w="4072" w:type="dxa"/>
+                  <w:tcW w:w="4964" w:type="dxa"/>
                 </w:tcPr>
                 <w:p>
                   <w:pPr>
@@ -3605,7 +3605,7 @@
               </w:tc>
               <w:tc>
                 <w:tcPr>
-                  <w:tcW w:w="232" w:type="dxa"/>
+                  <w:tcW w:w="283" w:type="dxa"/>
                 </w:tcPr>
                 <w:p>
                   <w:pPr>
@@ -3624,7 +3624,7 @@
               </w:tc>
               <w:tc>
                 <w:tcPr>
-                  <w:tcW w:w="4534" w:type="dxa"/>
+                  <w:tcW w:w="5525" w:type="dxa"/>
                 </w:tcPr>
                 <w:p>
                   <w:pPr>
@@ -3760,7 +3760,7 @@
         </w:trPr>
         <w:tc>
           <w:tcPr>
-            <w:tcW w:w="5000" w:type="pct"/>
+            <w:tcW w:w="10772" w:type="dxa"/>
             <w:gridSpan w:val="6"/>
             <w:tcBorders>
               <w:top w:val="single" w:sz="4" w:space="0" w:color="BFBFBF" w:themeColor="background1" w:themeShade="BF"/>
@@ -4313,7 +4313,7 @@
         </w:trPr>
         <w:tc>
           <w:tcPr>
-            <w:tcW w:w="8838" w:type="dxa"/>
+            <w:tcW w:w="10772" w:type="dxa"/>
             <w:gridSpan w:val="4"/>
             <w:tcBorders>
               <w:top w:val="nil"/>
@@ -4354,7 +4354,7 @@
         </w:trPr>
         <w:tc>
           <w:tcPr>
-            <w:tcW w:w="8838" w:type="dxa"/>
+            <w:tcW w:w="10772" w:type="dxa"/>
             <w:gridSpan w:val="4"/>
             <w:tcBorders>
               <w:top w:val="nil"/>
@@ -4384,7 +4384,7 @@
         </w:trPr>
         <w:tc>
           <w:tcPr>
-            <w:tcW w:w="1701" w:type="dxa"/>
+            <w:tcW w:w="2073" w:type="dxa"/>
             <w:tcBorders>
               <w:top w:val="single" w:sz="4" w:space="0" w:color="auto"/>
             </w:tcBorders>
@@ -4416,7 +4416,7 @@
         </w:tc>
         <w:tc>
           <w:tcPr>
-            <w:tcW w:w="1651" w:type="dxa"/>
+            <w:tcW w:w="2011" w:type="dxa"/>
             <w:tcBorders>
               <w:top w:val="single" w:sz="4" w:space="0" w:color="auto"/>
             </w:tcBorders>
@@ -4448,7 +4448,7 @@
         </w:tc>
         <w:tc>
           <w:tcPr>
-            <w:tcW w:w="5486" w:type="dxa"/>
+            <w:tcW w:w="6688" w:type="dxa"/>
             <w:tcBorders>
               <w:top w:val="single" w:sz="4" w:space="0" w:color="auto"/>
             </w:tcBorders>
@@ -4487,7 +4487,7 @@
         </w:trPr>
         <w:tc>
           <w:tcPr>
-            <w:tcW w:w="1701" w:type="dxa"/>
+            <w:tcW w:w="2073" w:type="dxa"/>
             <w:tcBorders>
               <w:top w:val="single" w:sz="4" w:space="0" w:color="auto"/>
             </w:tcBorders>
@@ -4515,7 +4515,7 @@
         </w:tc>
         <w:tc>
           <w:tcPr>
-            <w:tcW w:w="1651" w:type="dxa"/>
+            <w:tcW w:w="2011" w:type="dxa"/>
             <w:tcBorders>
               <w:top w:val="single" w:sz="4" w:space="0" w:color="auto"/>
             </w:tcBorders>
@@ -4561,7 +4561,7 @@
         </w:tc>
         <w:tc>
           <w:tcPr>
-            <w:tcW w:w="5486" w:type="dxa"/>
+            <w:tcW w:w="6688" w:type="dxa"/>
             <w:tcBorders>
               <w:top w:val="single" w:sz="4" w:space="0" w:color="auto"/>
             </w:tcBorders>
@@ -4603,7 +4603,7 @@
       <w:headerReference w:type="default" r:id="rId13"/>
       <w:footerReference w:type="default" r:id="rId14"/>
       <w:pgSz w:w="12240" w:h="15840"/>
-      <w:pgMar w:top="1469" w:right="1701" w:bottom="992" w:left="1701" w:header="709" w:footer="709" w:gutter="0"/>
+      <w:pgMar w:top="1469" w:right="734" w:bottom="992" w:left="734" w:header="709" w:footer="709" w:gutter="0"/>
       <w:cols w:space="708"/>
       <w:docGrid w:linePitch="360"/>
     </w:sectPr>

</xml_diff>